<commit_message>
Removing all references to S-125 incl file names
</commit_message>
<xml_diff>
--- a/output/body.docx
+++ b/output/body.docx
@@ -18,7 +18,7 @@
         <w:t xml:space="preserve">Service Specification for the Enhanced AtoN Information for AtoN Authorities</w:t>
       </w:r>
     </w:p>
-    <w:bookmarkStart w:id="70" w:name="sec:introduction"/>
+    <w:bookmarkStart w:id="70" w:name="_cebaa1f6ada0c89507e61caf930b3b1c7b5b035"/>
     <w:p>
       <w:pPr>
         <w:pStyle w:val="Heading1"/>
@@ -46,6 +46,7 @@
     </w:p>
     <w:p>
       <w:pPr>
+        <w:pStyle w:val="FirstParagraph"/>
         <w:numPr>
           <w:ilvl w:val="0"/>
           <w:numId w:val="1001"/>
@@ -57,6 +58,7 @@
     </w:p>
     <w:p>
       <w:pPr>
+        <w:pStyle w:val="FirstParagraph"/>
         <w:numPr>
           <w:ilvl w:val="0"/>
           <w:numId w:val="1001"/>
@@ -68,6 +70,7 @@
     </w:p>
     <w:p>
       <w:pPr>
+        <w:pStyle w:val="FirstParagraph"/>
         <w:numPr>
           <w:ilvl w:val="0"/>
           <w:numId w:val="1001"/>
@@ -102,7 +105,7 @@
         <w:t xml:space="preserve"> </w:t>
       </w:r>
       <w:r>
-        <w:t xml:space="preserve">data product provides a common structure for the exchange of information about AtoNs including metadata like maintenance schedules, equipment type such as battery and bulb types. This includes buoys, beacons, racons, lights, sound signals and AIS. The product specification can be used to exchange AtoN information in a consistent form between Lighthouse Authorities, Hydrographic Offices and other organisations to include commercial and professional agencies. This specific technical service may be referenced in other S-1xx product specifications and maritime services including MS12 - Nautical Publications and MS2 - AtoN.</w:t>
+        <w:t xml:space="preserve">data product provides a common structure for the exchange of information about AtoNs including metadata like maintenance schedules, equipment type such as battery and bulb types. This includes buoys, beacons, racons, lights, sound signals and AIS. The product specification can be used to exchange AtoN information in a consistent form between Lighthouse Authorities, Hydrographic Offices and other organisations to include commercial and professional agencies.</w:t>
       </w:r>
     </w:p>
     <w:p>
@@ -110,10 +113,16 @@
         <w:pStyle w:val="BodyText"/>
       </w:pPr>
       <w:r>
-        <w:t xml:space="preserve">This service specification may be used with the Maritime Connectivity Platform (MCP), where the MCP would provide means of authentication of service providers and service consumers as well as means of service discoverability.</w:t>
-      </w:r>
-    </w:p>
-    <w:bookmarkStart w:id="67" w:name="sec:introduction_purpose"/>
+        <w:rPr>
+          <w:strike/>
+        </w:rPr>
+        <w:t xml:space="preserve">This service specification may be used with the Maritime Connectivity Platform (MCP), where the MCP would provide means of authentication of service providers and service consumers as well as means of service discoverability-</w:t>
+      </w:r>
+      <w:r>
+        <w:t xml:space="preserve">.</w:t>
+      </w:r>
+    </w:p>
+    <w:bookmarkStart w:id="67" w:name="_8a70ae600c2f2575d602f31c2dd0fb160e903ee"/>
     <w:p>
       <w:pPr>
         <w:pStyle w:val="Heading2"/>
@@ -140,6 +149,7 @@
     </w:p>
     <w:p>
       <w:pPr>
+        <w:pStyle w:val="FirstParagraph"/>
         <w:numPr>
           <w:ilvl w:val="0"/>
           <w:numId w:val="1002"/>
@@ -151,6 +161,7 @@
     </w:p>
     <w:p>
       <w:pPr>
+        <w:pStyle w:val="FirstParagraph"/>
         <w:numPr>
           <w:ilvl w:val="1"/>
           <w:numId w:val="1003"/>
@@ -162,6 +173,7 @@
     </w:p>
     <w:p>
       <w:pPr>
+        <w:pStyle w:val="FirstParagraph"/>
         <w:numPr>
           <w:ilvl w:val="1"/>
           <w:numId w:val="1003"/>
@@ -173,6 +185,7 @@
     </w:p>
     <w:p>
       <w:pPr>
+        <w:pStyle w:val="FirstParagraph"/>
         <w:numPr>
           <w:ilvl w:val="1"/>
           <w:numId w:val="1003"/>
@@ -184,6 +197,7 @@
     </w:p>
     <w:p>
       <w:pPr>
+        <w:pStyle w:val="FirstParagraph"/>
         <w:numPr>
           <w:ilvl w:val="1"/>
           <w:numId w:val="1003"/>
@@ -195,6 +209,7 @@
     </w:p>
     <w:p>
       <w:pPr>
+        <w:pStyle w:val="FirstParagraph"/>
         <w:numPr>
           <w:ilvl w:val="0"/>
           <w:numId w:val="1002"/>
@@ -206,6 +221,7 @@
     </w:p>
     <w:p>
       <w:pPr>
+        <w:pStyle w:val="FirstParagraph"/>
         <w:numPr>
           <w:ilvl w:val="1"/>
           <w:numId w:val="1004"/>
@@ -217,6 +233,7 @@
     </w:p>
     <w:p>
       <w:pPr>
+        <w:pStyle w:val="FirstParagraph"/>
         <w:numPr>
           <w:ilvl w:val="1"/>
           <w:numId w:val="1004"/>
@@ -228,6 +245,7 @@
     </w:p>
     <w:p>
       <w:pPr>
+        <w:pStyle w:val="FirstParagraph"/>
         <w:numPr>
           <w:ilvl w:val="1"/>
           <w:numId w:val="1004"/>
@@ -239,6 +257,7 @@
     </w:p>
     <w:p>
       <w:pPr>
+        <w:pStyle w:val="FirstParagraph"/>
         <w:numPr>
           <w:ilvl w:val="1"/>
           <w:numId w:val="1004"/>
@@ -250,6 +269,7 @@
     </w:p>
     <w:p>
       <w:pPr>
+        <w:pStyle w:val="FirstParagraph"/>
         <w:numPr>
           <w:ilvl w:val="0"/>
           <w:numId w:val="1002"/>
@@ -260,7 +280,7 @@
       </w:r>
     </w:p>
     <w:bookmarkEnd w:id="67"/>
-    <w:bookmarkStart w:id="68" w:name="sec:intended_readership"/>
+    <w:bookmarkStart w:id="68" w:name="_75cdb2cf35dc3f49ea107c4f9696c61762a912b"/>
     <w:p>
       <w:pPr>
         <w:pStyle w:val="Heading2"/>
@@ -286,7 +306,7 @@
       </w:r>
     </w:p>
     <w:bookmarkEnd w:id="68"/>
-    <w:bookmarkStart w:id="69" w:name="sec:definitions"/>
+    <w:bookmarkStart w:id="69" w:name="_0e2e336535fb4ee815a78b63291ec94c78a11a5"/>
     <w:p>
       <w:pPr>
         <w:pStyle w:val="Heading2"/>
@@ -305,6 +325,7 @@
     </w:p>
     <w:p>
       <w:pPr>
+        <w:pStyle w:val="FirstParagraph"/>
         <w:numPr>
           <w:ilvl w:val="0"/>
           <w:numId w:val="1005"/>
@@ -326,6 +347,7 @@
     </w:p>
     <w:p>
       <w:pPr>
+        <w:pStyle w:val="FirstParagraph"/>
         <w:numPr>
           <w:ilvl w:val="0"/>
           <w:numId w:val="1005"/>
@@ -347,6 +369,7 @@
     </w:p>
     <w:p>
       <w:pPr>
+        <w:pStyle w:val="FirstParagraph"/>
         <w:numPr>
           <w:ilvl w:val="0"/>
           <w:numId w:val="1005"/>
@@ -368,6 +391,7 @@
     </w:p>
     <w:p>
       <w:pPr>
+        <w:pStyle w:val="FirstParagraph"/>
         <w:numPr>
           <w:ilvl w:val="0"/>
           <w:numId w:val="1005"/>
@@ -389,6 +413,7 @@
     </w:p>
     <w:p>
       <w:pPr>
+        <w:pStyle w:val="FirstParagraph"/>
         <w:numPr>
           <w:ilvl w:val="0"/>
           <w:numId w:val="1005"/>
@@ -410,6 +435,7 @@
     </w:p>
     <w:p>
       <w:pPr>
+        <w:pStyle w:val="FirstParagraph"/>
         <w:numPr>
           <w:ilvl w:val="0"/>
           <w:numId w:val="1005"/>
@@ -431,6 +457,7 @@
     </w:p>
     <w:p>
       <w:pPr>
+        <w:pStyle w:val="FirstParagraph"/>
         <w:numPr>
           <w:ilvl w:val="0"/>
           <w:numId w:val="1005"/>
@@ -452,6 +479,7 @@
     </w:p>
     <w:p>
       <w:pPr>
+        <w:pStyle w:val="FirstParagraph"/>
         <w:numPr>
           <w:ilvl w:val="0"/>
           <w:numId w:val="1005"/>
@@ -473,6 +501,7 @@
     </w:p>
     <w:p>
       <w:pPr>
+        <w:pStyle w:val="FirstParagraph"/>
         <w:numPr>
           <w:ilvl w:val="0"/>
           <w:numId w:val="1005"/>
@@ -499,7 +528,7 @@
     </w:p>
     <w:bookmarkEnd w:id="69"/>
     <w:bookmarkEnd w:id="70"/>
-    <w:bookmarkStart w:id="72" w:name="sec:service_identification"/>
+    <w:bookmarkStart w:id="72" w:name="_e710851414c003d59c3ee083ed484fd2b8ae855"/>
     <w:p>
       <w:pPr>
         <w:pStyle w:val="Heading1"/>
@@ -516,7 +545,7 @@
         <w:t xml:space="preserve">The purpose of this chapter is to provide a unique identification of the service and describe where the service is in terms of the engineering lifecycle.</w:t>
       </w:r>
     </w:p>
-    <w:bookmarkStart w:id="71" w:name="Xe81f6cc3951465dd1d3b5108fd94cdf22f3b8b6"/>
+    <w:bookmarkStart w:id="71" w:name="_e81f6cc3951465dd1d3b5108fd94cdf22f3b8b6"/>
     <w:p>
       <w:pPr>
         <w:pStyle w:val="TableCaption"/>
@@ -740,7 +769,7 @@
       </w:r>
     </w:p>
     <w:bookmarkEnd w:id="72"/>
-    <w:bookmarkStart w:id="96" w:name="sec:operational_context"/>
+    <w:bookmarkStart w:id="93" w:name="_a93e95d5348ae049a30c5bbf20a8724a0d721d3"/>
     <w:p>
       <w:pPr>
         <w:pStyle w:val="Heading1"/>
@@ -757,7 +786,7 @@
         <w:t xml:space="preserve">This section describes the context of the service from an operational perspective.</w:t>
       </w:r>
     </w:p>
-    <w:bookmarkStart w:id="77" w:name="sec:pres_125_operational_context"/>
+    <w:bookmarkStart w:id="73" w:name="_0c7b3b2791408a493b3bd1470e414ae33563719"/>
     <w:p>
       <w:pPr>
         <w:pStyle w:val="Heading2"/>
@@ -771,19 +800,7 @@
         <w:pStyle w:val="FirstParagraph"/>
       </w:pPr>
       <w:r>
-        <w:t xml:space="preserve">From a practical perspective, the List of Lights is intended for use by mariners as a compendium to the navigational chart for AtoN information. In accordance with IHO S-12, the</w:t>
-      </w:r>
-      <w:r>
-        <w:t xml:space="preserve"> </w:t>
-      </w:r>
-      <w:r>
-        <w:t xml:space="preserve">“List of Lights and Fog Signals”</w:t>
-      </w:r>
-      <w:r>
-        <w:t xml:space="preserve"> </w:t>
-      </w:r>
-      <w:r>
-        <w:t xml:space="preserve">describes maritime signal installations on land or afloat, producing light or sound signals (fog signals). In addition, these volumes contain information relating to certain other navigational aids: buoyage (day and night), signals (port signals, rescue signals, tide signals, etc.), radio-based aids (radio beacons, radar, radio navigation systems), etc.</w:t>
+        <w:t xml:space="preserve">The current situation of sharing AtoN information is quite fragmented, with multiple point-to-point non-interoperable systems, manual steps and long production periods.</w:t>
       </w:r>
     </w:p>
     <w:p>
@@ -791,7 +808,7 @@
         <w:pStyle w:val="BodyText"/>
       </w:pPr>
       <w:r>
-        <w:t xml:space="preserve">IHO S-53, is concerned with drafting navigational warnings or with the issuance of meteorological forecasts and warnings under the Global Maritime Distress and Safety System (GMDSS). Navigational Warnings (NW) are issued under the auspices of the IMO/IHO World-Wide Navigational Warning Service (WWNWS), in accordance with the requirements of IMO resolution A.706(17), as amended. NW, including AtoN casualties or changes which may impact navigational safety, are part of the Maritime Safety Information (MSI) system. MSI is promulgated in accordance with the requirements of IMO resolution A.705(17), as amended. It includes casualties to lights, fog signals, buoys and other aids to navigation affecting main shipping lanes as well as establishment of major new aids to navigation or significant changes to existing ones, when such establishment or change might be misleading to shipping. Currently, NW are promulgated as a radio broadcast and then printed in text format. The messages are standardized as SafetyNET, SafetyCast, NAVTEX broadcasts, and are in some countries accessible on the World Wide Web (WWW) or as voice broadcasts via coastal radio stations. System interfaces between NW publishers, NAVAREA (or Sub-Area) coordinator and broadcast service are not standardized, and may rely on manual processes involving e-mail, telephone, voice radio transmissions, fax, telex and manual re-entering of information from one system to another, or much more advanced solutions. Provision of NW via web is not standardized. NAVTEX, SafetyCast and SafetyNET cannot transport structured data formats for a joint NW-NM solution.</w:t>
+        <w:t xml:space="preserve">In many cases AtoN changes are shared via Notices-to-Mariners (NtM), which get published and appended onto the List-of-Lights (LoL) nautical publications. LoL updates can then be synchronised with chat corrections, which get more widely distributed. However, this process could take months to be completed.</w:t>
       </w:r>
     </w:p>
     <w:p>
@@ -799,10 +816,116 @@
         <w:pStyle w:val="BodyText"/>
       </w:pPr>
       <w:r>
-        <w:t xml:space="preserve">The pre-S-201 “present day” operational context of promulgation at the component level, is depicted below. A generalize assumption is made that information management systems are unique to each AtoN Administration.</w:t>
-      </w:r>
-    </w:p>
-    <w:bookmarkStart w:id="76" w:name="fig:present_day_operational_context"/>
+        <w:t xml:space="preserve">Even in the cases where certain administrations have progressed with their digitalisation efforts, introducing data sharing automation mechanisms, the system are primarily based on non-standardised data data structures. In addition, multiple levels of data access are employed to control the dissemination of information.</w:t>
+      </w:r>
+    </w:p>
+    <w:p>
+      <w:pPr>
+        <w:pStyle w:val="BodyText"/>
+      </w:pPr>
+      <w:r>
+        <w:t xml:space="preserve">End-Users include:</w:t>
+      </w:r>
+    </w:p>
+    <w:p>
+      <w:pPr>
+        <w:pStyle w:val="Compact"/>
+        <w:numPr>
+          <w:ilvl w:val="0"/>
+          <w:numId w:val="1006"/>
+        </w:numPr>
+      </w:pPr>
+      <w:r>
+        <w:t xml:space="preserve">HOs</w:t>
+      </w:r>
+    </w:p>
+    <w:p>
+      <w:pPr>
+        <w:pStyle w:val="Compact"/>
+        <w:numPr>
+          <w:ilvl w:val="0"/>
+          <w:numId w:val="1006"/>
+        </w:numPr>
+      </w:pPr>
+      <w:r>
+        <w:t xml:space="preserve">Maintenance Companies/Contractors</w:t>
+      </w:r>
+    </w:p>
+    <w:p>
+      <w:pPr>
+        <w:pStyle w:val="Compact"/>
+        <w:numPr>
+          <w:ilvl w:val="0"/>
+          <w:numId w:val="1006"/>
+        </w:numPr>
+      </w:pPr>
+      <w:r>
+        <w:t xml:space="preserve">VTS (AtoN &amp; Bathymetry)</w:t>
+      </w:r>
+    </w:p>
+    <w:p>
+      <w:pPr>
+        <w:pStyle w:val="Compact"/>
+        <w:numPr>
+          <w:ilvl w:val="0"/>
+          <w:numId w:val="1006"/>
+        </w:numPr>
+      </w:pPr>
+      <w:r>
+        <w:t xml:space="preserve">Requests for LoL information (including unlighted AtoN – mostly software charts/ECS) - Current electronic publications not in useful formats</w:t>
+      </w:r>
+    </w:p>
+    <w:p>
+      <w:pPr>
+        <w:pStyle w:val="Compact"/>
+        <w:numPr>
+          <w:ilvl w:val="0"/>
+          <w:numId w:val="1006"/>
+        </w:numPr>
+      </w:pPr>
+      <w:r>
+        <w:t xml:space="preserve">Port Authorities managing areas</w:t>
+      </w:r>
+    </w:p>
+    <w:p>
+      <w:pPr>
+        <w:pStyle w:val="Compact"/>
+        <w:numPr>
+          <w:ilvl w:val="0"/>
+          <w:numId w:val="1006"/>
+        </w:numPr>
+      </w:pPr>
+      <w:r>
+        <w:t xml:space="preserve">MRCC</w:t>
+      </w:r>
+    </w:p>
+    <w:bookmarkEnd w:id="73"/>
+    <w:bookmarkStart w:id="80" w:name="_12ed7c7549750c8681e4d41f08c526123b2c030"/>
+    <w:p>
+      <w:pPr>
+        <w:pStyle w:val="Heading2"/>
+      </w:pPr>
+      <w:r>
+        <w:t xml:space="preserve">Envisioned Operational Context</w:t>
+      </w:r>
+    </w:p>
+    <w:p>
+      <w:pPr>
+        <w:pStyle w:val="FirstParagraph"/>
+      </w:pPr>
+      <w:r>
+        <w:t xml:space="preserve">A standardized structured AtoN information format would enable compatible systems to exchange AtoN information seamlessly. Each AtoN Administration may have a unique AtoN Information Management System. This system however, should be able to automatically promulgate AtoN data from the authoritative source, for use by national and local authorities (e.g. Coastal State Authorities, Harbor and Port Authorities), public, as well as being available for use by maintenance providers and commercial contractors.</w:t>
+      </w:r>
+    </w:p>
+    <w:p>
+      <w:pPr>
+        <w:pStyle w:val="BodyText"/>
+      </w:pPr>
+      <w:r>
+        <w:t xml:space="preserve">AtoN Administrations will administer and publish local AtoN data, for their area of responsibility. Typically this includes areas within that state’s exclusive economic zone. Where appropriate they should coordinate with adjacent or overlapping AtoN Administrations who share responsibility within the same waterway. (e.g. Both the U.S. Coast Guard and Canadian Coast Guard maintain aids to navigation within the waterways comprising the Great Lakes.) The service instance descriptions will provide detailed information of coverage area available to users.</w:t>
+      </w:r>
+    </w:p>
+    <w:bookmarkStart w:id="77" w:name="_35a3b4033c094762f3e62f8ac88cbcf23c6afc9"/>
     <w:p>
       <w:pPr>
         <w:pStyle w:val="CaptionedFigure"/>
@@ -810,111 +933,20 @@
       <w:r>
         <w:drawing>
           <wp:inline>
-            <wp:extent cx="6477000" cy="3238500"/>
+            <wp:extent cx="6477000" cy="3209165"/>
             <wp:effectExtent b="0" l="0" r="0" t="0"/>
-            <wp:docPr descr="Pre S-201 “Present Day” Operational Context." title="" id="74" name="Picture"/>
+            <wp:docPr descr="Example of the AtoN information flow, as per [3]." title="" id="75" name="Picture"/>
             <a:graphic>
               <a:graphicData uri="http://schemas.openxmlformats.org/drawingml/2006/picture">
                 <pic:pic>
                   <pic:nvPicPr>
-                    <pic:cNvPr descr="source/guideline/../../resources/PresentDayOperationalContext.png" id="75" name="Picture"/>
+                    <pic:cNvPr descr="source/guideline/../../resources/AtoNInfoDistribution.png" id="76" name="Picture"/>
                     <pic:cNvPicPr>
                       <a:picLocks noChangeArrowheads="1" noChangeAspect="1"/>
                     </pic:cNvPicPr>
                   </pic:nvPicPr>
                   <pic:blipFill>
-                    <a:blip r:embed="rId73"/>
-                    <a:stretch>
-                      <a:fillRect/>
-                    </a:stretch>
-                  </pic:blipFill>
-                  <pic:spPr bwMode="auto">
-                    <a:xfrm>
-                      <a:off x="0" y="0"/>
-                      <a:ext cx="6477000" cy="3238500"/>
-                    </a:xfrm>
-                    <a:prstGeom prst="rect">
-                      <a:avLst/>
-                    </a:prstGeom>
-                    <a:noFill/>
-                    <a:ln w="9525">
-                      <a:noFill/>
-                      <a:headEnd/>
-                      <a:tailEnd/>
-                    </a:ln>
-                  </pic:spPr>
-                </pic:pic>
-              </a:graphicData>
-            </a:graphic>
-          </wp:inline>
-        </w:drawing>
-      </w:r>
-    </w:p>
-    <w:p>
-      <w:pPr>
-        <w:pStyle w:val="ImageCaption"/>
-      </w:pPr>
-      <w:r>
-        <w:t xml:space="preserve">Pre S-201 “Present Day” Operational Context.</w:t>
-      </w:r>
-    </w:p>
-    <w:bookmarkEnd w:id="76"/>
-    <w:p>
-      <w:pPr>
-        <w:pStyle w:val="BodyText"/>
-      </w:pPr>
-      <w:r>
-        <w:t xml:space="preserve">System interfaces between AtoN Administrations, Hydrographic Officers, Nautical Publication Publishers, and dissemination methods are unique, and may rely on manual processes involving carriage of paper print copies or human readable digital renditions obtained via web services or email. Provision of the AtoN information included within the List of Lights via web services is not standardized.</w:t>
-      </w:r>
-    </w:p>
-    <w:bookmarkEnd w:id="77"/>
-    <w:bookmarkStart w:id="84" w:name="sec:envisioned_operational_context"/>
-    <w:p>
-      <w:pPr>
-        <w:pStyle w:val="Heading2"/>
-      </w:pPr>
-      <w:r>
-        <w:t xml:space="preserve">Envisioned Operational Context</w:t>
-      </w:r>
-    </w:p>
-    <w:p>
-      <w:pPr>
-        <w:pStyle w:val="FirstParagraph"/>
-      </w:pPr>
-      <w:r>
-        <w:t xml:space="preserve">A standardized structured AtoN information format would enable compatible systems to exchange AtoN information seamlessly. Each AtoN Administration may have a unique AtoN Information Management System. This system however, should be able to automatically promulgate AtoN data from the authoritative source, for use by national and local authorities (e.g. Coastal State Authorities, Harbor and Port Authorities), the mariner public, as well as being available for use by commercial value-added service providers.</w:t>
-      </w:r>
-    </w:p>
-    <w:p>
-      <w:pPr>
-        <w:pStyle w:val="BodyText"/>
-      </w:pPr>
-      <w:r>
-        <w:t xml:space="preserve">AtoN Administrations will administer and publish local AtoN data, for their area of responsibility. Typically this includes areas within that state’s exclusive economic zone. Where appropriate they should coordinate with adjacent or overlapping AtoN Administrations who share responsibility within the same waterway. (e.g. Both the U.S. Coast Guard and Canadian Coast Guard maintain aids to navigation within the waterways comprising the Great Lakes.) The service instance descriptions will provide detailed information of coverage area available to users.</w:t>
-      </w:r>
-    </w:p>
-    <w:bookmarkStart w:id="81" w:name="fig:ms_aton_information_flow"/>
-    <w:p>
-      <w:pPr>
-        <w:pStyle w:val="CaptionedFigure"/>
-      </w:pPr>
-      <w:r>
-        <w:drawing>
-          <wp:inline>
-            <wp:extent cx="6477000" cy="3209165"/>
-            <wp:effectExtent b="0" l="0" r="0" t="0"/>
-            <wp:docPr descr="Example of the AtoN information flow, as per [3]." title="" id="79" name="Picture"/>
-            <a:graphic>
-              <a:graphicData uri="http://schemas.openxmlformats.org/drawingml/2006/picture">
-                <pic:pic>
-                  <pic:nvPicPr>
-                    <pic:cNvPr descr="source/guideline/../../resources/AtoNInfoDistribution.png" id="80" name="Picture"/>
-                    <pic:cNvPicPr>
-                      <a:picLocks noChangeArrowheads="1" noChangeAspect="1"/>
-                    </pic:cNvPicPr>
-                  </pic:nvPicPr>
-                  <pic:blipFill>
-                    <a:blip r:embed="rId78"/>
+                    <a:blip r:embed="rId74"/>
                     <a:stretch>
                       <a:fillRect/>
                     </a:stretch>
@@ -958,10 +990,10 @@
         <w:t xml:space="preserve">.</w:t>
       </w:r>
     </w:p>
-    <w:bookmarkEnd w:id="81"/>
-    <w:p>
-      <w:pPr>
-        <w:pStyle w:val="BodyText"/>
+    <w:bookmarkEnd w:id="77"/>
+    <w:p>
+      <w:pPr>
+        <w:pStyle w:val="FirstParagraph"/>
       </w:pPr>
       <w:r>
         <w:t xml:space="preserve">The service described in this specification defines the exchange of enhanced AtoN information using S-201 between a service provider and the end-user of such a service. In the most common case, according to the IALA interpretation of the IMO</w:t>
@@ -989,7 +1021,7 @@
         <w:t xml:space="preserve">[3]</w:t>
       </w:r>
       <w:r>
-        <w:t xml:space="preserve">, as illustrated in Figure 2, the end user will be a member of staff of another Lighthouse Authority or a Hydrographic Office. It may also be used to harmonise the exchange of AtoN information between the various stakeholders in the data distribution chain before it is propagated towards the mariners. This includes the data exchange between AtoN Authorities, coastal authorities and Regional Electronic Navigational Chart Coordination Centre (RENCs).</w:t>
+        <w:t xml:space="preserve">, as illustrated in Figure 1, the end user will be a member of staff of another Lighthouse Authority or a Hydrographic Office. It may also be used to harmonise the exchange of AtoN information between the various stakeholders in the data distribution chain before it is propagated towards the mariners.</w:t>
       </w:r>
     </w:p>
     <w:p>
@@ -1000,13 +1032,13 @@
         <w:t xml:space="preserve">Depending on the specific requirements, the service usage patterns may differ. For example, a Hydrographic Office could pull all available data and subscribe to updates from a data producer (e.g. national AtoN authority) and redistribute the data to the RENCs via S-101 and S-125 (after applying validation checks or optimising the data for a specific group of end-users). The orchestration of multiple AtoN information services in the distribution chain, however, is not in the scope of this document and lies within the responsibility of the service provider(s).</w:t>
       </w:r>
     </w:p>
-    <w:bookmarkStart w:id="82" w:name="sec:relationship_124_s125_s201"/>
+    <w:bookmarkStart w:id="78" w:name="_8e8b22d3dd073b4a06e9e9b5fd749d3bf0aea06"/>
     <w:p>
       <w:pPr>
         <w:pStyle w:val="Heading3"/>
       </w:pPr>
       <w:r>
-        <w:t xml:space="preserve">Relationships between S-125 and S-101, S-124, S-201</w:t>
+        <w:t xml:space="preserve">Relationships between S-S201 and S-101, S-124, S-125</w:t>
       </w:r>
     </w:p>
     <w:p>
@@ -1014,7 +1046,7 @@
         <w:pStyle w:val="FirstParagraph"/>
       </w:pPr>
       <w:r>
-        <w:t xml:space="preserve">IHO has produced guidance on the interoperability between S-125 and the S-101, S-124, S-201 data product specifications</w:t>
+        <w:t xml:space="preserve">IHO has produced guidance on the interoperability between S-201 and the S-101, S-124, S-125 data product specifications</w:t>
       </w:r>
       <w:r>
         <w:t xml:space="preserve"> </w:t>
@@ -1026,8 +1058,8 @@
         <w:t xml:space="preserve">. This document provides guidance on how S-125 will work on ECDIS devices and mentions the change of scope for editions 1.0.0 and 2.0.0 of the data product. This change limits the scope of S-125 to an overlay displaying only information on any AtoN status changes, which differ from the design state that appears in S-101. For more information please refer the IHO document.</w:t>
       </w:r>
     </w:p>
-    <w:bookmarkEnd w:id="82"/>
-    <w:bookmarkStart w:id="83" w:name="sec:discoverability_and_dissemination"/>
+    <w:bookmarkEnd w:id="78"/>
+    <w:bookmarkStart w:id="79" w:name="_431b4c7c0bec48953198f4e093b06a6850ebef0"/>
     <w:p>
       <w:pPr>
         <w:pStyle w:val="Heading3"/>
@@ -1041,12 +1073,12 @@
         <w:pStyle w:val="FirstParagraph"/>
       </w:pPr>
       <w:r>
-        <w:t xml:space="preserve">The S-201 data should be discoverable only by Hydrographic Offices, Coastal State Authorities and other relevant organisations. S-201 data should enhance S-101 ENC, S-124 NW and S-125 AtoN digital services, especially by reducing the effort in the transformation of data, with the harmonization of data models. This could be accomplished by introducing efficient data exchange mechanism between authorities.</w:t>
-      </w:r>
-    </w:p>
-    <w:bookmarkEnd w:id="83"/>
-    <w:bookmarkEnd w:id="84"/>
-    <w:bookmarkStart w:id="87" w:name="sec:functional_non_functional_reqs"/>
+        <w:t xml:space="preserve">The S-201 data should be discoverable only by Hydrographic Offices, Coastal State Authorities and other relevant authorised organisations. S-201 data should enhance S-101 ENC, S-124 NW and S-125 AtoN digital services, especially by reducing the effort in the transformation of data, with the harmonization of data models. This could be accomplished by introducing efficient data exchange mechanism between authorities.</w:t>
+      </w:r>
+    </w:p>
+    <w:bookmarkEnd w:id="79"/>
+    <w:bookmarkEnd w:id="80"/>
+    <w:bookmarkStart w:id="83" w:name="_1d50306b0c6da372e31ff71aaefc5a40aa3c744"/>
     <w:p>
       <w:pPr>
         <w:pStyle w:val="Heading2"/>
@@ -1072,7 +1104,7 @@
         <w:t xml:space="preserve">. Please note that the feature identifiers referenced in Table 2, are also referring to service features identified in the IALA MS-2 specification document.</w:t>
       </w:r>
     </w:p>
-    <w:bookmarkStart w:id="85" w:name="tbl:ms2-functional-requirements"/>
+    <w:bookmarkStart w:id="81" w:name="_02b0e388442401573b3ba21c8ac6e31c1b27dfa"/>
     <w:p>
       <w:pPr>
         <w:pStyle w:val="TableCaption"/>
@@ -1251,7 +1283,7 @@
               <w:pStyle w:val="Compact"/>
             </w:pPr>
             <w:r>
-              <w:t xml:space="preserve">Request for dataset(s)</w:t>
+              <w:t xml:space="preserve">On-demand request for dataset(s)</w:t>
             </w:r>
           </w:p>
         </w:tc>
@@ -1678,7 +1710,7 @@
               <w:pStyle w:val="Compact"/>
             </w:pPr>
             <w:r>
-              <w:t xml:space="preserve">Data Validation Certificate</w:t>
+              <w:t xml:space="preserve">Data Authenticity Certificate</w:t>
             </w:r>
           </w:p>
         </w:tc>
@@ -2044,29 +2076,29 @@
               <w:pStyle w:val="Compact"/>
             </w:pPr>
             <w:r>
-              <w:t xml:space="preserve">End-User Precision Tailoring</w:t>
-            </w:r>
-          </w:p>
-        </w:tc>
-        <w:tc>
-          <w:tcPr/>
-          <w:p>
-            <w:pPr>
-              <w:pStyle w:val="Compact"/>
-            </w:pPr>
-            <w:r>
-              <w:t xml:space="preserve">The service is able to supply AtoN information with certain details (e.g. precision of decimal points) tailored to the corresponding end-user.</w:t>
-            </w:r>
-          </w:p>
-        </w:tc>
-        <w:tc>
-          <w:tcPr/>
-          <w:p>
-            <w:pPr>
-              <w:pStyle w:val="Compact"/>
-            </w:pPr>
-            <w:r>
-              <w:t xml:space="preserve">F010, F018</w:t>
+              <w:t xml:space="preserve">Change Log</w:t>
+            </w:r>
+          </w:p>
+        </w:tc>
+        <w:tc>
+          <w:tcPr/>
+          <w:p>
+            <w:pPr>
+              <w:pStyle w:val="Compact"/>
+            </w:pPr>
+            <w:r>
+              <w:t xml:space="preserve">The service allows data producers to track the record of changes to the advertised dataset(s) for any time interval required.</w:t>
+            </w:r>
+          </w:p>
+        </w:tc>
+        <w:tc>
+          <w:tcPr/>
+          <w:p>
+            <w:pPr>
+              <w:pStyle w:val="Compact"/>
+            </w:pPr>
+            <w:r>
+              <w:t xml:space="preserve">F015</w:t>
             </w:r>
           </w:p>
         </w:tc>
@@ -2105,67 +2137,6 @@
               <w:pStyle w:val="Compact"/>
             </w:pPr>
             <w:r>
-              <w:t xml:space="preserve">Change Log</w:t>
-            </w:r>
-          </w:p>
-        </w:tc>
-        <w:tc>
-          <w:tcPr/>
-          <w:p>
-            <w:pPr>
-              <w:pStyle w:val="Compact"/>
-            </w:pPr>
-            <w:r>
-              <w:t xml:space="preserve">The service allows data producers to track the record of changes to the advertised dataset(s) for any time interval required.</w:t>
-            </w:r>
-          </w:p>
-        </w:tc>
-        <w:tc>
-          <w:tcPr/>
-          <w:p>
-            <w:pPr>
-              <w:pStyle w:val="Compact"/>
-            </w:pPr>
-            <w:r>
-              <w:t xml:space="preserve">F015</w:t>
-            </w:r>
-          </w:p>
-        </w:tc>
-      </w:tr>
-      <w:tr>
-        <w:tc>
-          <w:tcPr/>
-          <w:p>
-            <w:pPr>
-              <w:pStyle w:val="Compact"/>
-            </w:pPr>
-            <w:r>
-              <w:rPr>
-                <w:b/>
-                <w:bCs/>
-              </w:rPr>
-              <w:t xml:space="preserve">Functional</w:t>
-            </w:r>
-          </w:p>
-        </w:tc>
-        <w:tc>
-          <w:tcPr/>
-          <w:p>
-            <w:pPr>
-              <w:pStyle w:val="Compact"/>
-            </w:pPr>
-            <w:r>
-              <w:t xml:space="preserve">MS2-FR019</w:t>
-            </w:r>
-          </w:p>
-        </w:tc>
-        <w:tc>
-          <w:tcPr/>
-          <w:p>
-            <w:pPr>
-              <w:pStyle w:val="Compact"/>
-            </w:pPr>
-            <w:r>
               <w:t xml:space="preserve">Change Log State</w:t>
             </w:r>
           </w:p>
@@ -2194,10 +2165,10 @@
         </w:tc>
       </w:tr>
     </w:tbl>
-    <w:bookmarkEnd w:id="85"/>
-    <w:p>
-      <w:pPr>
-        <w:pStyle w:val="BodyText"/>
+    <w:bookmarkEnd w:id="81"/>
+    <w:p>
+      <w:pPr>
+        <w:pStyle w:val="FirstParagraph"/>
       </w:pPr>
       <w:r>
         <w:t xml:space="preserve">The table below defines non-functional requirements for the S-201 service, as these are defined in the IALA documentation for the IMO MS-2 Aids to Navigation Maritime Service</w:t>
@@ -2212,7 +2183,7 @@
         <w:t xml:space="preserve">. Please note that the feature identifiers referenced in Table 3, are also referring to service features identified in the IALA MS-2 specification document.</w:t>
       </w:r>
     </w:p>
-    <w:bookmarkStart w:id="86" w:name="tbl:ms2-non-functional-requirements"/>
+    <w:bookmarkStart w:id="82" w:name="_d1aee2a6c49f33016a7b77ce87e9db6ade29b8e"/>
     <w:p>
       <w:pPr>
         <w:pStyle w:val="TableCaption"/>
@@ -2907,9 +2878,9 @@
         </w:tc>
       </w:tr>
     </w:tbl>
-    <w:bookmarkEnd w:id="86"/>
-    <w:bookmarkEnd w:id="87"/>
-    <w:bookmarkStart w:id="95" w:name="sec:other_constraints"/>
+    <w:bookmarkEnd w:id="82"/>
+    <w:bookmarkEnd w:id="83"/>
+    <w:bookmarkStart w:id="92" w:name="_14fc30dcd5e77c13bc3f9060fde862015a07e69"/>
     <w:p>
       <w:pPr>
         <w:pStyle w:val="Heading2"/>
@@ -2918,7 +2889,7 @@
         <w:t xml:space="preserve">Other Constraints</w:t>
       </w:r>
     </w:p>
-    <w:bookmarkStart w:id="88" w:name="sec:relevant_industrial_standards"/>
+    <w:bookmarkStart w:id="84" w:name="_873269c4c3f8f12521a617d611b8a6008b85e31"/>
     <w:p>
       <w:pPr>
         <w:pStyle w:val="Heading3"/>
@@ -2935,8 +2906,8 @@
         <w:t xml:space="preserve">Not Applicable</w:t>
       </w:r>
     </w:p>
-    <w:bookmarkEnd w:id="88"/>
-    <w:bookmarkStart w:id="90" w:name="sec:operational_nodes"/>
+    <w:bookmarkEnd w:id="84"/>
+    <w:bookmarkStart w:id="86" w:name="_8163d062d576734fd3b2607387a8ed52d48fce1"/>
     <w:p>
       <w:pPr>
         <w:pStyle w:val="Heading3"/>
@@ -2953,7 +2924,7 @@
         <w:t xml:space="preserve">The following tables describe the operational nodes of the service.</w:t>
       </w:r>
     </w:p>
-    <w:bookmarkStart w:id="89" w:name="tbl:operational_nodes"/>
+    <w:bookmarkStart w:id="85" w:name="_c6cee0a2aadc5addbd4155c13d15a1a44448423"/>
     <w:p>
       <w:pPr>
         <w:pStyle w:val="TableCaption"/>
@@ -3122,9 +3093,9 @@
         </w:tc>
       </w:tr>
     </w:tbl>
-    <w:bookmarkEnd w:id="89"/>
-    <w:bookmarkEnd w:id="90"/>
-    <w:bookmarkStart w:id="92" w:name="sec:operational_activities"/>
+    <w:bookmarkEnd w:id="85"/>
+    <w:bookmarkEnd w:id="86"/>
+    <w:bookmarkStart w:id="88" w:name="_3d0d89e38de618286adff8cde90d35fc70c9e93"/>
     <w:p>
       <w:pPr>
         <w:pStyle w:val="Heading3"/>
@@ -3141,7 +3112,7 @@
         <w:t xml:space="preserve">The following tables describe the operational activities of the service.</w:t>
       </w:r>
     </w:p>
-    <w:bookmarkStart w:id="91" w:name="tbl:operational_activities"/>
+    <w:bookmarkStart w:id="87" w:name="_6a7fdc54116b04a67f7a253c2601719f3395620"/>
     <w:p>
       <w:pPr>
         <w:pStyle w:val="TableCaption"/>
@@ -3370,9 +3341,9 @@
         </w:tc>
       </w:tr>
     </w:tbl>
-    <w:bookmarkEnd w:id="91"/>
-    <w:bookmarkEnd w:id="92"/>
-    <w:bookmarkStart w:id="94" w:name="sec:use-cases"/>
+    <w:bookmarkEnd w:id="87"/>
+    <w:bookmarkEnd w:id="88"/>
+    <w:bookmarkStart w:id="91" w:name="_ec415f45fad67e567037ccd55b43803f5371771"/>
     <w:p>
       <w:pPr>
         <w:pStyle w:val="Heading3"/>
@@ -3381,7 +3352,7 @@
         <w:t xml:space="preserve">Use Cases</w:t>
       </w:r>
     </w:p>
-    <w:bookmarkStart w:id="93" w:name="use-case-1"/>
+    <w:bookmarkStart w:id="89" w:name="_49ba3fe3fbc8cfbe0b1de69ecf617e1473b2dc0"/>
     <w:p>
       <w:pPr>
         <w:pStyle w:val="Heading4"/>
@@ -3402,7 +3373,7 @@
         <w:t xml:space="preserve">Name</w:t>
       </w:r>
       <w:r>
-        <w:t xml:space="preserve">: Retrieve AtoN status indication information for portrayal on a Hydrographic Office</w:t>
+        <w:t xml:space="preserve">: Retrieve AtoN status indication information for portrayal by a Hydrographic Office</w:t>
       </w:r>
     </w:p>
     <w:p>
@@ -3485,7 +3456,7 @@
         <w:pStyle w:val="Compact"/>
         <w:numPr>
           <w:ilvl w:val="0"/>
-          <w:numId w:val="1006"/>
+          <w:numId w:val="1007"/>
         </w:numPr>
       </w:pPr>
       <w:r>
@@ -3497,7 +3468,7 @@
         <w:pStyle w:val="Compact"/>
         <w:numPr>
           <w:ilvl w:val="0"/>
-          <w:numId w:val="1006"/>
+          <w:numId w:val="1007"/>
         </w:numPr>
       </w:pPr>
       <w:r>
@@ -3509,7 +3480,7 @@
         <w:pStyle w:val="Compact"/>
         <w:numPr>
           <w:ilvl w:val="0"/>
-          <w:numId w:val="1006"/>
+          <w:numId w:val="1007"/>
         </w:numPr>
       </w:pPr>
       <w:r>
@@ -3531,22 +3502,14 @@
         <w:t xml:space="preserve">: The correct AtoN status indication information is displayed.</w:t>
       </w:r>
     </w:p>
-    <w:p>
-      <w:r>
-        <w:br w:type="page"/>
-      </w:r>
-    </w:p>
-    <w:bookmarkEnd w:id="93"/>
-    <w:bookmarkEnd w:id="94"/>
-    <w:bookmarkEnd w:id="95"/>
-    <w:bookmarkEnd w:id="96"/>
-    <w:bookmarkStart w:id="156" w:name="sec:service_overview"/>
-    <w:p>
-      <w:pPr>
-        <w:pStyle w:val="Heading1"/>
-      </w:pPr>
-      <w:r>
-        <w:t xml:space="preserve">Service Overview</w:t>
+    <w:bookmarkEnd w:id="89"/>
+    <w:bookmarkStart w:id="90" w:name="_8ddbc7482bacb3eea801960f06377ee405bba81"/>
+    <w:p>
+      <w:pPr>
+        <w:pStyle w:val="Heading4"/>
+      </w:pPr>
+      <w:r>
+        <w:t xml:space="preserve">Use-case #2</w:t>
       </w:r>
     </w:p>
     <w:p>
@@ -3554,43 +3517,205 @@
         <w:pStyle w:val="FirstParagraph"/>
       </w:pPr>
       <w:r>
-        <w:t xml:space="preserve">This section aims at providing an overview of the main elements of the service. Architectural elements applicable for this description are:</w:t>
-      </w:r>
-    </w:p>
-    <w:p>
-      <w:pPr>
+        <w:rPr>
+          <w:b/>
+          <w:bCs/>
+        </w:rPr>
+        <w:t xml:space="preserve">Name</w:t>
+      </w:r>
+      <w:r>
+        <w:t xml:space="preserve">: Retrieve AtoN status indication information for portrayal by an ECS Provider</w:t>
+      </w:r>
+    </w:p>
+    <w:p>
+      <w:pPr>
+        <w:pStyle w:val="BodyText"/>
+      </w:pPr>
+      <w:r>
+        <w:rPr>
+          <w:b/>
+          <w:bCs/>
+        </w:rPr>
+        <w:t xml:space="preserve">Description</w:t>
+      </w:r>
+      <w:r>
+        <w:t xml:space="preserve">: Retrieve and portray changes on the design state of AtoN for charting.</w:t>
+      </w:r>
+    </w:p>
+    <w:p>
+      <w:pPr>
+        <w:pStyle w:val="BodyText"/>
+      </w:pPr>
+      <w:r>
+        <w:rPr>
+          <w:b/>
+          <w:bCs/>
+        </w:rPr>
+        <w:t xml:space="preserve">Actors</w:t>
+      </w:r>
+      <w:r>
+        <w:t xml:space="preserve">: AtoN information service, ECS Provider</w:t>
+      </w:r>
+    </w:p>
+    <w:p>
+      <w:pPr>
+        <w:pStyle w:val="BodyText"/>
+      </w:pPr>
+      <w:r>
+        <w:rPr>
+          <w:b/>
+          <w:bCs/>
+        </w:rPr>
+        <w:t xml:space="preserve">Frequency of Use</w:t>
+      </w:r>
+      <w:r>
+        <w:t xml:space="preserve">: Ad-hoc, typically triggered upon an update request by the ECS Provider</w:t>
+      </w:r>
+    </w:p>
+    <w:p>
+      <w:pPr>
+        <w:pStyle w:val="BodyText"/>
+      </w:pPr>
+      <w:r>
+        <w:rPr>
+          <w:b/>
+          <w:bCs/>
+        </w:rPr>
+        <w:t xml:space="preserve">Pre-conditions</w:t>
+      </w:r>
+      <w:r>
+        <w:t xml:space="preserve">: The service instance is known to the relevant system or has access to a service registry in which the service instance can be discovered. Data is packaged in S-201 datasets with MRN attributes populated. S-201 datasets cannot be broken apart into division beyond those established by the authoritative source for liability reasons.</w:t>
+      </w:r>
+    </w:p>
+    <w:p>
+      <w:pPr>
+        <w:pStyle w:val="BodyText"/>
+      </w:pPr>
+      <w:r>
+        <w:rPr>
+          <w:b/>
+          <w:bCs/>
+        </w:rPr>
+        <w:t xml:space="preserve">Ordinary Sequence</w:t>
+      </w:r>
+      <w:r>
+        <w:t xml:space="preserve">:</w:t>
+      </w:r>
+    </w:p>
+    <w:p>
+      <w:pPr>
+        <w:pStyle w:val="Compact"/>
         <w:numPr>
           <w:ilvl w:val="0"/>
-          <w:numId w:val="1007"/>
+          <w:numId w:val="1008"/>
         </w:numPr>
       </w:pPr>
       <w:r>
-        <w:t xml:space="preserve">Service - the element representing the service, as a whole</w:t>
-      </w:r>
-    </w:p>
-    <w:p>
-      <w:pPr>
+        <w:t xml:space="preserve">The AtoN status indication information is requested from the service.</w:t>
+      </w:r>
+    </w:p>
+    <w:p>
+      <w:pPr>
+        <w:pStyle w:val="Compact"/>
         <w:numPr>
           <w:ilvl w:val="0"/>
-          <w:numId w:val="1007"/>
+          <w:numId w:val="1008"/>
         </w:numPr>
       </w:pPr>
       <w:r>
-        <w:t xml:space="preserve">Service Operations - describe the logical operations used to access the service. Actual technical designs may rename some of the operations or ignore some of the operations if the operation is triggered in a different way e.g. API-based designs require more operations than an event-based design. Multiple service operations may also be implemented by a single API endpoint with e.g. different HTTP methods differentiating between operations.</w:t>
-      </w:r>
-    </w:p>
-    <w:p>
-      <w:pPr>
+        <w:t xml:space="preserve">The service directly answers the request with the appropriate data. These include the S-201 AtoN status indication features of the data product, but not necessarily the design state AtoN information.</w:t>
+      </w:r>
+    </w:p>
+    <w:p>
+      <w:pPr>
+        <w:pStyle w:val="Compact"/>
         <w:numPr>
           <w:ilvl w:val="0"/>
-          <w:numId w:val="1007"/>
+          <w:numId w:val="1008"/>
         </w:numPr>
       </w:pPr>
       <w:r>
+        <w:t xml:space="preserve">The data is rendered and displayed to the user.</w:t>
+      </w:r>
+    </w:p>
+    <w:p>
+      <w:pPr>
+        <w:pStyle w:val="FirstParagraph"/>
+      </w:pPr>
+      <w:r>
+        <w:rPr>
+          <w:b/>
+          <w:bCs/>
+        </w:rPr>
+        <w:t xml:space="preserve">Post-conditions</w:t>
+      </w:r>
+      <w:r>
+        <w:t xml:space="preserve">: The correct AtoN status indication information is displayed.</w:t>
+      </w:r>
+    </w:p>
+    <w:p>
+      <w:r>
+        <w:br w:type="page"/>
+      </w:r>
+    </w:p>
+    <w:bookmarkEnd w:id="90"/>
+    <w:bookmarkEnd w:id="91"/>
+    <w:bookmarkEnd w:id="92"/>
+    <w:bookmarkEnd w:id="93"/>
+    <w:bookmarkStart w:id="153" w:name="_c6773ec9deba3dc0e37ed3b00bbf6797c608910"/>
+    <w:p>
+      <w:pPr>
+        <w:pStyle w:val="Heading1"/>
+      </w:pPr>
+      <w:r>
+        <w:t xml:space="preserve">Service Overview</w:t>
+      </w:r>
+    </w:p>
+    <w:p>
+      <w:pPr>
+        <w:pStyle w:val="FirstParagraph"/>
+      </w:pPr>
+      <w:r>
+        <w:t xml:space="preserve">This section aims at providing an overview of the main elements of the service. Architectural elements applicable for this description are:</w:t>
+      </w:r>
+    </w:p>
+    <w:p>
+      <w:pPr>
+        <w:pStyle w:val="FirstParagraph"/>
+        <w:numPr>
+          <w:ilvl w:val="0"/>
+          <w:numId w:val="1009"/>
+        </w:numPr>
+      </w:pPr>
+      <w:r>
+        <w:t xml:space="preserve">Service - the element representing the service, as a whole</w:t>
+      </w:r>
+    </w:p>
+    <w:p>
+      <w:pPr>
+        <w:pStyle w:val="FirstParagraph"/>
+        <w:numPr>
+          <w:ilvl w:val="0"/>
+          <w:numId w:val="1009"/>
+        </w:numPr>
+      </w:pPr>
+      <w:r>
+        <w:t xml:space="preserve">Service Operations - describe the logical operations used to access the service. Actual technical designs may rename some of the operations or ignore some of the operations if the operation is triggered in a different way e.g. API-based designs require more operations than an event-based design. Multiple service operations may also be implemented by a single API endpoint with e.g. different HTTP methods differentiating between operations.</w:t>
+      </w:r>
+    </w:p>
+    <w:p>
+      <w:pPr>
+        <w:pStyle w:val="FirstParagraph"/>
+        <w:numPr>
+          <w:ilvl w:val="0"/>
+          <w:numId w:val="1009"/>
+        </w:numPr>
+      </w:pPr>
+      <w:r>
         <w:t xml:space="preserve">Service Operations Parameter Definitions - identify logical data structures being exchanged via Service Operations. These parameters must not be an exhaustive list but describe the parameters that are required for the business logic to work.</w:t>
       </w:r>
     </w:p>
-    <w:bookmarkStart w:id="101" w:name="sec:the_aton_information_service"/>
+    <w:bookmarkStart w:id="98" w:name="_3e1515a25ed25cd3070e37340495b63ecbc6929"/>
     <w:p>
       <w:pPr>
         <w:pStyle w:val="Heading2"/>
@@ -3604,10 +3729,10 @@
         <w:pStyle w:val="FirstParagraph"/>
       </w:pPr>
       <w:r>
-        <w:t xml:space="preserve">In Figure 3, below, an overview of the operations of the Enhanced AtoN Information service is shown.</w:t>
-      </w:r>
-    </w:p>
-    <w:bookmarkStart w:id="100" w:name="fig:s125_service_operations"/>
+        <w:t xml:space="preserve">In Figure 2, below, an overview of the operations of the Enhanced AtoN Information service is shown.</w:t>
+      </w:r>
+    </w:p>
+    <w:bookmarkStart w:id="97" w:name="_1384d941d0552bf25556574d26836da9fd27d44"/>
     <w:p>
       <w:pPr>
         <w:pStyle w:val="CaptionedFigure"/>
@@ -3617,18 +3742,18 @@
           <wp:inline>
             <wp:extent cx="6477000" cy="4501558"/>
             <wp:effectExtent b="0" l="0" r="0" t="0"/>
-            <wp:docPr descr="S-201 Service Operations Definition diagram." title="" id="98" name="Picture"/>
+            <wp:docPr descr="S-201 Service Operations Definition diagram." title="" id="95" name="Picture"/>
             <a:graphic>
               <a:graphicData uri="http://schemas.openxmlformats.org/drawingml/2006/picture">
                 <pic:pic>
                   <pic:nvPicPr>
-                    <pic:cNvPr descr="source/guideline/../../resources/ServiceInterfaces.png" id="99" name="Picture"/>
+                    <pic:cNvPr descr="source/guideline/../../resources/ServiceInterfaces.png" id="96" name="Picture"/>
                     <pic:cNvPicPr>
                       <a:picLocks noChangeArrowheads="1" noChangeAspect="1"/>
                     </pic:cNvPicPr>
                   </pic:nvPicPr>
                   <pic:blipFill>
-                    <a:blip r:embed="rId97"/>
+                    <a:blip r:embed="rId94"/>
                     <a:stretch>
                       <a:fillRect/>
                     </a:stretch>
@@ -3663,7 +3788,7 @@
         <w:t xml:space="preserve">S-201 Service Operations Definition diagram.</w:t>
       </w:r>
     </w:p>
-    <w:bookmarkEnd w:id="100"/>
+    <w:bookmarkEnd w:id="97"/>
     <w:p>
       <w:pPr>
         <w:pStyle w:val="TableCaption"/>
@@ -3875,7 +4000,7 @@
               <w:pStyle w:val="Compact"/>
               <w:numPr>
                 <w:ilvl w:val="0"/>
-                <w:numId w:val="1008"/>
+                <w:numId w:val="1010"/>
               </w:numPr>
             </w:pPr>
             <w:r>
@@ -3887,7 +4012,7 @@
               <w:pStyle w:val="Compact"/>
               <w:numPr>
                 <w:ilvl w:val="0"/>
-                <w:numId w:val="1008"/>
+                <w:numId w:val="1010"/>
               </w:numPr>
             </w:pPr>
             <w:r>
@@ -3943,7 +4068,7 @@
               <w:pStyle w:val="Compact"/>
               <w:numPr>
                 <w:ilvl w:val="0"/>
-                <w:numId w:val="1009"/>
+                <w:numId w:val="1011"/>
               </w:numPr>
             </w:pPr>
             <w:r>
@@ -4114,8 +4239,8 @@
         </w:tc>
       </w:tr>
     </w:tbl>
-    <w:bookmarkEnd w:id="101"/>
-    <w:bookmarkStart w:id="155" w:name="sec:service_operations"/>
+    <w:bookmarkEnd w:id="98"/>
+    <w:bookmarkStart w:id="152" w:name="_8ec60c03d81b264660dc44fa5935218694efd0d"/>
     <w:p>
       <w:pPr>
         <w:pStyle w:val="Heading2"/>
@@ -4168,7 +4293,7 @@
         <w:t xml:space="preserve">This section covers only the static design description, while the dynamic design (behaviour) is described in Section 7. The operations are designed to be compliant to the SECOM standard on a basic level. However, the SECOM standard explicitly prescribes the usage of certain technologies (such as REST). Therefore, this service specification provides an abstraction layer above SECOM that makes it possible to also realize the operations with different technology stacks.</w:t>
       </w:r>
     </w:p>
-    <w:bookmarkStart w:id="109" w:name="sec:get_operation"/>
+    <w:bookmarkStart w:id="106" w:name="_1d9eb138c247f2be468b221ee477c5d4f6f2a1f"/>
     <w:p>
       <w:pPr>
         <w:pStyle w:val="Heading3"/>
@@ -4201,7 +4326,7 @@
         <w:t xml:space="preserve">operation is used by service consumers for filtering and retrieving enhanced AtoN information from a service provider, e.g. S-201 datasets that are applicable for a specified geographical area. The consumer can also filter the requested S-201 dataset results by a specific dataset reference identifier, a time period etc.</w:t>
       </w:r>
     </w:p>
-    <w:bookmarkStart w:id="105" w:name="fig:get_operation"/>
+    <w:bookmarkStart w:id="102" w:name="_504ba3b37c3b80fc806851828d5f3dcf9d507eb"/>
     <w:p>
       <w:pPr>
         <w:pStyle w:val="CaptionedFigure"/>
@@ -4211,18 +4336,18 @@
           <wp:inline>
             <wp:extent cx="4857750" cy="1412204"/>
             <wp:effectExtent b="0" l="0" r="0" t="0"/>
-            <wp:docPr descr="Get operation." title="" id="103" name="Picture"/>
+            <wp:docPr descr="Get operation." title="" id="100" name="Picture"/>
             <a:graphic>
               <a:graphicData uri="http://schemas.openxmlformats.org/drawingml/2006/picture">
                 <pic:pic>
                   <pic:nvPicPr>
-                    <pic:cNvPr descr="source/guideline/../../resources/GetInterface.png" id="104" name="Picture"/>
+                    <pic:cNvPr descr="source/guideline/../../resources/GetInterface.png" id="101" name="Picture"/>
                     <pic:cNvPicPr>
                       <a:picLocks noChangeArrowheads="1" noChangeAspect="1"/>
                     </pic:cNvPicPr>
                   </pic:nvPicPr>
                   <pic:blipFill>
-                    <a:blip r:embed="rId102"/>
+                    <a:blip r:embed="rId99"/>
                     <a:stretch>
                       <a:fillRect/>
                     </a:stretch>
@@ -4257,8 +4382,8 @@
         <w:t xml:space="preserve">Get operation.</w:t>
       </w:r>
     </w:p>
-    <w:bookmarkEnd w:id="105"/>
-    <w:bookmarkStart w:id="106" w:name="sec:get_operation_functionality"/>
+    <w:bookmarkEnd w:id="102"/>
+    <w:bookmarkStart w:id="103" w:name="_3239f3487a37edf19db784eb271e64b3b5f2c7c"/>
     <w:p>
       <w:pPr>
         <w:pStyle w:val="Heading4"/>
@@ -4360,8 +4485,8 @@
         <w:t xml:space="preserve">input parameter can be utilised to provide access to the full enhanced AtoN information (including the AtoN structure/equipment features) for the respective datasets. These are expected to be much larger and the AtoN feature information may not be processed for portrayal on the ECDIS. If the full AtoN feature information is requested but not available, the service should respond with the default datasets containing only the AtoN status indication features.</w:t>
       </w:r>
     </w:p>
-    <w:bookmarkEnd w:id="106"/>
-    <w:bookmarkStart w:id="108" w:name="sec:get_operation_parameters"/>
+    <w:bookmarkEnd w:id="103"/>
+    <w:bookmarkStart w:id="105" w:name="_78b6615e0a365e3aacd7bcbc1e1850784773a51"/>
     <w:p>
       <w:pPr>
         <w:pStyle w:val="Heading4"/>
@@ -4370,7 +4495,7 @@
         <w:t xml:space="preserve">Operation Parameters</w:t>
       </w:r>
     </w:p>
-    <w:bookmarkStart w:id="107" w:name="tbl:get_operational_parameters"/>
+    <w:bookmarkStart w:id="104" w:name="_7d995f6f43475c240ab80a8469096d7a07175d9"/>
     <w:p>
       <w:pPr>
         <w:pStyle w:val="TableCaption"/>
@@ -4673,10 +4798,10 @@
         </w:tc>
       </w:tr>
     </w:tbl>
-    <w:bookmarkEnd w:id="107"/>
-    <w:bookmarkEnd w:id="108"/>
-    <w:bookmarkEnd w:id="109"/>
-    <w:bookmarkStart w:id="118" w:name="sec:get_summary_operation"/>
+    <w:bookmarkEnd w:id="104"/>
+    <w:bookmarkEnd w:id="105"/>
+    <w:bookmarkEnd w:id="106"/>
+    <w:bookmarkStart w:id="115" w:name="_6d0b26ff9f6bb30d28900da73f0b714df9b8eec"/>
     <w:p>
       <w:pPr>
         <w:pStyle w:val="Heading3"/>
@@ -4709,7 +4834,7 @@
         <w:t xml:space="preserve">is used by service consumers for retrieving a list of summary information (without the actual dataset contents), in order to discover which S-201 datasets are being currently made available (and are accessible) by a service provider. The service provider will respond by listing the available (and accessible) S-201 datasets that are of interest to the consumer. This list should only contain summary information on each dataset, not the dataset content itself. The dataset reference identifiers can be used to retrieve the full S-201 datasets via the Get operation. The consumer can filter the requested S-201 dataset summary results by a specific dataset identifier reference, a geometry, a time period etc.</w:t>
       </w:r>
     </w:p>
-    <w:bookmarkStart w:id="113" w:name="fig:get_summary_operation"/>
+    <w:bookmarkStart w:id="110" w:name="_32203145c7b157dcfcb13050112c246bcbf7c70"/>
     <w:p>
       <w:pPr>
         <w:pStyle w:val="CaptionedFigure"/>
@@ -4719,18 +4844,18 @@
           <wp:inline>
             <wp:extent cx="6477000" cy="1865063"/>
             <wp:effectExtent b="0" l="0" r="0" t="0"/>
-            <wp:docPr descr="Get Summary operation." title="" id="111" name="Picture"/>
+            <wp:docPr descr="Get Summary operation." title="" id="108" name="Picture"/>
             <a:graphic>
               <a:graphicData uri="http://schemas.openxmlformats.org/drawingml/2006/picture">
                 <pic:pic>
                   <pic:nvPicPr>
-                    <pic:cNvPr descr="source/guideline/../../resources/GetSummaryInterface.png" id="112" name="Picture"/>
+                    <pic:cNvPr descr="source/guideline/../../resources/GetSummaryInterface.png" id="109" name="Picture"/>
                     <pic:cNvPicPr>
                       <a:picLocks noChangeArrowheads="1" noChangeAspect="1"/>
                     </pic:cNvPicPr>
                   </pic:nvPicPr>
                   <pic:blipFill>
-                    <a:blip r:embed="rId110"/>
+                    <a:blip r:embed="rId107"/>
                     <a:stretch>
                       <a:fillRect/>
                     </a:stretch>
@@ -4765,8 +4890,8 @@
         <w:t xml:space="preserve">Get Summary operation.</w:t>
       </w:r>
     </w:p>
-    <w:bookmarkEnd w:id="113"/>
-    <w:bookmarkStart w:id="114" w:name="sec:get_summary_operation_functionality"/>
+    <w:bookmarkEnd w:id="110"/>
+    <w:bookmarkStart w:id="111" w:name="_5baf5dee8c3a12ade3116800037190120a5b88d"/>
     <w:p>
       <w:pPr>
         <w:pStyle w:val="Heading4"/>
@@ -4868,8 +4993,8 @@
         <w:t xml:space="preserve">input parameter can be utilised to return the summary information for the full datasets, including the AtoN structure/equipment features. If the full AtoN feature information is requested but not available, the service should respond with the summary of the default datasets containing only the AtoN status indication features.</w:t>
       </w:r>
     </w:p>
-    <w:bookmarkEnd w:id="114"/>
-    <w:bookmarkStart w:id="117" w:name="sec:get_summary_operation_parameters"/>
+    <w:bookmarkEnd w:id="111"/>
+    <w:bookmarkStart w:id="114" w:name="_bc9448d5941feda8033efdd14be604d16d06e93"/>
     <w:p>
       <w:pPr>
         <w:pStyle w:val="Heading4"/>
@@ -4878,7 +5003,7 @@
         <w:t xml:space="preserve">Operation Parameters</w:t>
       </w:r>
     </w:p>
-    <w:bookmarkStart w:id="115" w:name="tbl:get_summary_operational_parameters"/>
+    <w:bookmarkStart w:id="112" w:name="_005fd55acdcdf87d2c3df18ffc3c98e2b3baee3"/>
     <w:p>
       <w:pPr>
         <w:pStyle w:val="TableCaption"/>
@@ -5181,9 +5306,9 @@
         </w:tc>
       </w:tr>
     </w:tbl>
-    <w:bookmarkEnd w:id="115"/>
+    <w:bookmarkEnd w:id="112"/>
     <w:p/>
-    <w:bookmarkStart w:id="116" w:name="tbl:get_summary_return_types"/>
+    <w:bookmarkStart w:id="113" w:name="_72e82e1e02481fa5571d35fe8f28c403bfca816"/>
     <w:p>
       <w:pPr>
         <w:pStyle w:val="TableCaption"/>
@@ -5302,10 +5427,10 @@
         </w:tc>
       </w:tr>
     </w:tbl>
-    <w:bookmarkEnd w:id="116"/>
-    <w:bookmarkEnd w:id="117"/>
-    <w:bookmarkEnd w:id="118"/>
-    <w:bookmarkStart w:id="127" w:name="sec:subscription_operation"/>
+    <w:bookmarkEnd w:id="113"/>
+    <w:bookmarkEnd w:id="114"/>
+    <w:bookmarkEnd w:id="115"/>
+    <w:bookmarkStart w:id="124" w:name="_d3339b598aae3809e0033d7f9c6e49d56b9aee1"/>
     <w:p>
       <w:pPr>
         <w:pStyle w:val="Heading3"/>
@@ -5322,7 +5447,7 @@
         <w:t xml:space="preserve">The purpose of this operation is to facilitate subscriptions initiated by service consumers on specific enhanced AtoN information datasets. The information a service consumer subscribes to, can either determined by the provided operation parameters, or decided upon by the service provider.</w:t>
       </w:r>
     </w:p>
-    <w:bookmarkStart w:id="122" w:name="fig:subscription_operation"/>
+    <w:bookmarkStart w:id="119" w:name="_a9b64d1ba177956511551c427df313b171f9e93"/>
     <w:p>
       <w:pPr>
         <w:pStyle w:val="CaptionedFigure"/>
@@ -5332,18 +5457,18 @@
           <wp:inline>
             <wp:extent cx="4857750" cy="1459082"/>
             <wp:effectExtent b="0" l="0" r="0" t="0"/>
-            <wp:docPr descr="Subscription operation." title="" id="120" name="Picture"/>
+            <wp:docPr descr="Subscription operation." title="" id="117" name="Picture"/>
             <a:graphic>
               <a:graphicData uri="http://schemas.openxmlformats.org/drawingml/2006/picture">
                 <pic:pic>
                   <pic:nvPicPr>
-                    <pic:cNvPr descr="source/guideline/../../resources/SubscriptionInterface.png" id="121" name="Picture"/>
+                    <pic:cNvPr descr="source/guideline/../../resources/SubscriptionInterface.png" id="118" name="Picture"/>
                     <pic:cNvPicPr>
                       <a:picLocks noChangeArrowheads="1" noChangeAspect="1"/>
                     </pic:cNvPicPr>
                   </pic:nvPicPr>
                   <pic:blipFill>
-                    <a:blip r:embed="rId119"/>
+                    <a:blip r:embed="rId116"/>
                     <a:stretch>
                       <a:fillRect/>
                     </a:stretch>
@@ -5378,8 +5503,8 @@
         <w:t xml:space="preserve">Subscription operation.</w:t>
       </w:r>
     </w:p>
-    <w:bookmarkEnd w:id="122"/>
-    <w:bookmarkStart w:id="123" w:name="sec:subscription_operation_functionality"/>
+    <w:bookmarkEnd w:id="119"/>
+    <w:bookmarkStart w:id="120" w:name="_aa6e759c598bd66a23975841cd89ce2c5fe398a"/>
     <w:p>
       <w:pPr>
         <w:pStyle w:val="Heading4"/>
@@ -5434,7 +5559,7 @@
         <w:pStyle w:val="Compact"/>
         <w:numPr>
           <w:ilvl w:val="0"/>
-          <w:numId w:val="1010"/>
+          <w:numId w:val="1012"/>
         </w:numPr>
       </w:pPr>
       <w:r>
@@ -5446,7 +5571,7 @@
         <w:pStyle w:val="Compact"/>
         <w:numPr>
           <w:ilvl w:val="0"/>
-          <w:numId w:val="1010"/>
+          <w:numId w:val="1012"/>
         </w:numPr>
       </w:pPr>
       <w:r>
@@ -5507,8 +5632,8 @@
         <w:t xml:space="preserve">input parameter can be utilised to allow subscriptions to the full datasets, including the AtoN structure/equipment features. If the full AtoN feature information is requested but not available, the service should respond with the default datasets containing only the AtoN status indication features.</w:t>
       </w:r>
     </w:p>
-    <w:bookmarkEnd w:id="123"/>
-    <w:bookmarkStart w:id="126" w:name="sec:subscription_operation_parameters"/>
+    <w:bookmarkEnd w:id="120"/>
+    <w:bookmarkStart w:id="123" w:name="_f236ddb4e87f275a17f21d07069515c1539ecbf"/>
     <w:p>
       <w:pPr>
         <w:pStyle w:val="Heading4"/>
@@ -5517,7 +5642,7 @@
         <w:t xml:space="preserve">Operation Parameters</w:t>
       </w:r>
     </w:p>
-    <w:bookmarkStart w:id="124" w:name="tbl:subscription_operational_parameters"/>
+    <w:bookmarkStart w:id="121" w:name="_c90fac741592ba5f757ac023d8ebf9a4a481e45"/>
     <w:p>
       <w:pPr>
         <w:pStyle w:val="TableCaption"/>
@@ -5820,9 +5945,9 @@
         </w:tc>
       </w:tr>
     </w:tbl>
-    <w:bookmarkEnd w:id="124"/>
+    <w:bookmarkEnd w:id="121"/>
     <w:p/>
-    <w:bookmarkStart w:id="125" w:name="tbl:subscription_return_types"/>
+    <w:bookmarkStart w:id="122" w:name="_26cec743a1f3439248fdbe67fa70884f8a7370c"/>
     <w:p>
       <w:pPr>
         <w:pStyle w:val="TableCaption"/>
@@ -5941,10 +6066,10 @@
         </w:tc>
       </w:tr>
     </w:tbl>
-    <w:bookmarkEnd w:id="125"/>
-    <w:bookmarkEnd w:id="126"/>
-    <w:bookmarkEnd w:id="127"/>
-    <w:bookmarkStart w:id="136" w:name="sec:remove_subscription_operation"/>
+    <w:bookmarkEnd w:id="122"/>
+    <w:bookmarkEnd w:id="123"/>
+    <w:bookmarkEnd w:id="124"/>
+    <w:bookmarkStart w:id="133" w:name="_f95ab5260366de099655af5e19d7bf5355eb33a"/>
     <w:p>
       <w:pPr>
         <w:pStyle w:val="Heading3"/>
@@ -5961,7 +6086,7 @@
         <w:t xml:space="preserve">Subscriptions are removed either internally by the service provider, or externally by the service consumer. This operation can be used by the consumer to request the removal of an active subscription.</w:t>
       </w:r>
     </w:p>
-    <w:bookmarkStart w:id="131" w:name="fig:remove_subscription_operation"/>
+    <w:bookmarkStart w:id="128" w:name="_3388d7f4d974d0a07a43863800c1643e3dcee52"/>
     <w:p>
       <w:pPr>
         <w:pStyle w:val="CaptionedFigure"/>
@@ -5971,18 +6096,18 @@
           <wp:inline>
             <wp:extent cx="4857750" cy="1406344"/>
             <wp:effectExtent b="0" l="0" r="0" t="0"/>
-            <wp:docPr descr="Remove Subscription operation." title="" id="129" name="Picture"/>
+            <wp:docPr descr="Remove Subscription operation." title="" id="126" name="Picture"/>
             <a:graphic>
               <a:graphicData uri="http://schemas.openxmlformats.org/drawingml/2006/picture">
                 <pic:pic>
                   <pic:nvPicPr>
-                    <pic:cNvPr descr="source/guideline/../../resources/RemoveSubscriptionInterface.png" id="130" name="Picture"/>
+                    <pic:cNvPr descr="source/guideline/../../resources/RemoveSubscriptionInterface.png" id="127" name="Picture"/>
                     <pic:cNvPicPr>
                       <a:picLocks noChangeArrowheads="1" noChangeAspect="1"/>
                     </pic:cNvPicPr>
                   </pic:nvPicPr>
                   <pic:blipFill>
-                    <a:blip r:embed="rId128"/>
+                    <a:blip r:embed="rId125"/>
                     <a:stretch>
                       <a:fillRect/>
                     </a:stretch>
@@ -6017,8 +6142,8 @@
         <w:t xml:space="preserve">Remove Subscription operation.</w:t>
       </w:r>
     </w:p>
-    <w:bookmarkEnd w:id="131"/>
-    <w:bookmarkStart w:id="132" w:name="X1bac26e8d63e8df3e8ad5f896e815deeaf16fc5"/>
+    <w:bookmarkEnd w:id="128"/>
+    <w:bookmarkStart w:id="129" w:name="_1bac26e8d63e8df3e8ad5f896e815deeaf16fc5"/>
     <w:p>
       <w:pPr>
         <w:pStyle w:val="Heading4"/>
@@ -6048,7 +6173,7 @@
         <w:pStyle w:val="Compact"/>
         <w:numPr>
           <w:ilvl w:val="0"/>
-          <w:numId w:val="1011"/>
+          <w:numId w:val="1013"/>
         </w:numPr>
       </w:pPr>
       <w:r>
@@ -6063,8 +6188,8 @@
         <w:t xml:space="preserve">The Subscription Notification operation is used to inform the consumer that on the status of the subscription, i.e. when it has been successfully removed.</w:t>
       </w:r>
     </w:p>
-    <w:bookmarkEnd w:id="132"/>
-    <w:bookmarkStart w:id="135" w:name="X653cbdac61d28b5a4c7ce709f8481fbd9679310"/>
+    <w:bookmarkEnd w:id="129"/>
+    <w:bookmarkStart w:id="132" w:name="_653cbdac61d28b5a4c7ce709f8481fbd9679310"/>
     <w:p>
       <w:pPr>
         <w:pStyle w:val="Heading4"/>
@@ -6073,7 +6198,7 @@
         <w:t xml:space="preserve">Operation Parameters</w:t>
       </w:r>
     </w:p>
-    <w:bookmarkStart w:id="133" w:name="X7db507f1f511da79f3c73c1a4b447f5ebbffc00"/>
+    <w:bookmarkStart w:id="130" w:name="_7db507f1f511da79f3c73c1a4b447f5ebbffc00"/>
     <w:p>
       <w:pPr>
         <w:pStyle w:val="TableCaption"/>
@@ -6192,9 +6317,9 @@
         </w:tc>
       </w:tr>
     </w:tbl>
-    <w:bookmarkEnd w:id="133"/>
+    <w:bookmarkEnd w:id="130"/>
     <w:p/>
-    <w:bookmarkStart w:id="134" w:name="tbl:remove_subscription_return_types"/>
+    <w:bookmarkStart w:id="131" w:name="_f223d2f4094eef579c43a6c708e9bce53efc609"/>
     <w:p>
       <w:pPr>
         <w:pStyle w:val="TableCaption"/>
@@ -6313,10 +6438,10 @@
         </w:tc>
       </w:tr>
     </w:tbl>
-    <w:bookmarkEnd w:id="134"/>
-    <w:bookmarkEnd w:id="135"/>
-    <w:bookmarkEnd w:id="136"/>
-    <w:bookmarkStart w:id="145" w:name="sec:upload_operation"/>
+    <w:bookmarkEnd w:id="131"/>
+    <w:bookmarkEnd w:id="132"/>
+    <w:bookmarkEnd w:id="133"/>
+    <w:bookmarkStart w:id="142" w:name="_1d03e9ec6097c442edb3211b4889eee4c242c8b"/>
     <w:p>
       <w:pPr>
         <w:pStyle w:val="Heading3"/>
@@ -6348,7 +6473,7 @@
         <w:t xml:space="preserve">: This may not be implemented as a separate interface as different technologies already implement this functionality on other levels (e.g., by using a message-oriented middleware like the MCP MMS, RabbitMQ or Kafka).</w:t>
       </w:r>
     </w:p>
-    <w:bookmarkStart w:id="140" w:name="fig:upload_operation"/>
+    <w:bookmarkStart w:id="137" w:name="_405bfeb55735570071dee063a014904e692379f"/>
     <w:p>
       <w:pPr>
         <w:pStyle w:val="CaptionedFigure"/>
@@ -6358,18 +6483,18 @@
           <wp:inline>
             <wp:extent cx="4857750" cy="2208068"/>
             <wp:effectExtent b="0" l="0" r="0" t="0"/>
-            <wp:docPr descr="Upload operation." title="" id="138" name="Picture"/>
+            <wp:docPr descr="Upload operation." title="" id="135" name="Picture"/>
             <a:graphic>
               <a:graphicData uri="http://schemas.openxmlformats.org/drawingml/2006/picture">
                 <pic:pic>
                   <pic:nvPicPr>
-                    <pic:cNvPr descr="source/guideline/../../resources/UploadInterface.png" id="139" name="Picture"/>
+                    <pic:cNvPr descr="source/guideline/../../resources/UploadInterface.png" id="136" name="Picture"/>
                     <pic:cNvPicPr>
                       <a:picLocks noChangeArrowheads="1" noChangeAspect="1"/>
                     </pic:cNvPicPr>
                   </pic:nvPicPr>
                   <pic:blipFill>
-                    <a:blip r:embed="rId137"/>
+                    <a:blip r:embed="rId134"/>
                     <a:stretch>
                       <a:fillRect/>
                     </a:stretch>
@@ -6404,8 +6529,8 @@
         <w:t xml:space="preserve">Upload operation.</w:t>
       </w:r>
     </w:p>
-    <w:bookmarkEnd w:id="140"/>
-    <w:bookmarkStart w:id="141" w:name="sec:upload_operation_functionality"/>
+    <w:bookmarkEnd w:id="137"/>
+    <w:bookmarkStart w:id="138" w:name="_84b853ba3341563e290e91782ed1f99198056db"/>
     <w:p>
       <w:pPr>
         <w:pStyle w:val="Heading4"/>
@@ -6458,7 +6583,7 @@
         <w:pStyle w:val="Compact"/>
         <w:numPr>
           <w:ilvl w:val="0"/>
-          <w:numId w:val="1012"/>
+          <w:numId w:val="1014"/>
         </w:numPr>
       </w:pPr>
       <w:r>
@@ -6496,8 +6621,8 @@
         <w:t xml:space="preserve">The acknowledgement message may be expected to be received when the uploaded message has been delivered to end system (technical acknowledgement), and/or if supported, when the message has been opened (read) by the end-user (operational acknowledgement). More information on this can be found in Section 7.2, describing the dynamic behaviour description of the subscription operation.</w:t>
       </w:r>
     </w:p>
-    <w:bookmarkEnd w:id="141"/>
-    <w:bookmarkStart w:id="144" w:name="sec:upload_operation_parameters"/>
+    <w:bookmarkEnd w:id="138"/>
+    <w:bookmarkStart w:id="141" w:name="_0c9dcad903314eb0bd5551a0f47ca26c28a48d8"/>
     <w:p>
       <w:pPr>
         <w:pStyle w:val="Heading4"/>
@@ -6506,7 +6631,7 @@
         <w:t xml:space="preserve">Operation Parameters</w:t>
       </w:r>
     </w:p>
-    <w:bookmarkStart w:id="142" w:name="tbl:upload_operational_parameters"/>
+    <w:bookmarkStart w:id="139" w:name="_47b917f8d654b070a77bb628cb9aee05c4d3c5b"/>
     <w:p>
       <w:pPr>
         <w:pStyle w:val="TableCaption"/>
@@ -6717,9 +6842,9 @@
         </w:tc>
       </w:tr>
     </w:tbl>
-    <w:bookmarkEnd w:id="142"/>
+    <w:bookmarkEnd w:id="139"/>
     <w:p/>
-    <w:bookmarkStart w:id="143" w:name="tbl:upload_return_types"/>
+    <w:bookmarkStart w:id="140" w:name="_a14dbf3642db4ecf522d1d333a3d82d247e9596"/>
     <w:p>
       <w:pPr>
         <w:pStyle w:val="TableCaption"/>
@@ -6837,10 +6962,10 @@
         </w:tc>
       </w:tr>
     </w:tbl>
-    <w:bookmarkEnd w:id="143"/>
-    <w:bookmarkEnd w:id="144"/>
-    <w:bookmarkEnd w:id="145"/>
-    <w:bookmarkStart w:id="154" w:name="sec:subscription_notification_operation"/>
+    <w:bookmarkEnd w:id="140"/>
+    <w:bookmarkEnd w:id="141"/>
+    <w:bookmarkEnd w:id="142"/>
+    <w:bookmarkStart w:id="151" w:name="_de8099684741534585c057cd8b05d02ac56c529"/>
     <w:p>
       <w:pPr>
         <w:pStyle w:val="Heading3"/>
@@ -6872,7 +6997,7 @@
         <w:t xml:space="preserve">: This may not be implemented as a separate operation as different technologies already implement this functionality on other levels (e.g., by using a message-oriented middleware like the MCP MMS, RabbitMQ or Kafka).</w:t>
       </w:r>
     </w:p>
-    <w:bookmarkStart w:id="149" w:name="fig:subscription_notification_operation"/>
+    <w:bookmarkStart w:id="146" w:name="_785f54fde5f8a87e219565937575f16c9545427"/>
     <w:p>
       <w:pPr>
         <w:pStyle w:val="CaptionedFigure"/>
@@ -6882,18 +7007,18 @@
           <wp:inline>
             <wp:extent cx="4857750" cy="2069522"/>
             <wp:effectExtent b="0" l="0" r="0" t="0"/>
-            <wp:docPr descr="Subscription Notification operation." title="" id="147" name="Picture"/>
+            <wp:docPr descr="Subscription Notification operation." title="" id="144" name="Picture"/>
             <a:graphic>
               <a:graphicData uri="http://schemas.openxmlformats.org/drawingml/2006/picture">
                 <pic:pic>
                   <pic:nvPicPr>
-                    <pic:cNvPr descr="source/guideline/../../resources/SubscriptionNotificationInterface.png" id="148" name="Picture"/>
+                    <pic:cNvPr descr="source/guideline/../../resources/SubscriptionNotificationInterface.png" id="145" name="Picture"/>
                     <pic:cNvPicPr>
                       <a:picLocks noChangeArrowheads="1" noChangeAspect="1"/>
                     </pic:cNvPicPr>
                   </pic:nvPicPr>
                   <pic:blipFill>
-                    <a:blip r:embed="rId146"/>
+                    <a:blip r:embed="rId143"/>
                     <a:stretch>
                       <a:fillRect/>
                     </a:stretch>
@@ -6928,8 +7053,8 @@
         <w:t xml:space="preserve">Subscription Notification operation.</w:t>
       </w:r>
     </w:p>
-    <w:bookmarkEnd w:id="149"/>
-    <w:bookmarkStart w:id="150" w:name="Xf78cb36710e7a9a8ad84a401a976abedcbd7e82"/>
+    <w:bookmarkEnd w:id="146"/>
+    <w:bookmarkStart w:id="147" w:name="_f78cb36710e7a9a8ad84a401a976abedcbd7e82"/>
     <w:p>
       <w:pPr>
         <w:pStyle w:val="Heading4"/>
@@ -6946,8 +7071,8 @@
         <w:t xml:space="preserve">The operation receives notifications by the service provider, when a subscription is created or removed, either internally by the information owner, or externally on request. This operation follows a one-way paradigm (ONE_WAY), where a service sends data to consumer without expecting information back, other than a technical response. More information on this operation can be found in Section Section 7, describing the dynamic behaviour description of the subscription on enhanced AtoN information.</w:t>
       </w:r>
     </w:p>
-    <w:bookmarkEnd w:id="150"/>
-    <w:bookmarkStart w:id="153" w:name="X52b47f999cb38430c43d8c4a932ea67b6509eec"/>
+    <w:bookmarkEnd w:id="147"/>
+    <w:bookmarkStart w:id="150" w:name="_52b47f999cb38430c43d8c4a932ea67b6509eec"/>
     <w:p>
       <w:pPr>
         <w:pStyle w:val="Heading4"/>
@@ -6956,7 +7081,7 @@
         <w:t xml:space="preserve">Operation Parameters</w:t>
       </w:r>
     </w:p>
-    <w:bookmarkStart w:id="151" w:name="X4a5f9649b449730308343b9f9c6324addca667f"/>
+    <w:bookmarkStart w:id="148" w:name="_4a5f9649b449730308343b9f9c6324addca667f"/>
     <w:p>
       <w:pPr>
         <w:pStyle w:val="TableCaption"/>
@@ -7121,9 +7246,9 @@
         </w:tc>
       </w:tr>
     </w:tbl>
-    <w:bookmarkEnd w:id="151"/>
+    <w:bookmarkEnd w:id="148"/>
     <w:p/>
-    <w:bookmarkStart w:id="152" w:name="X5fec97643d09b5c2a4a9e63015cd3cbbbc867cd"/>
+    <w:bookmarkStart w:id="149" w:name="_5fec97643d09b5c2a4a9e63015cd3cbbbc867cd"/>
     <w:p>
       <w:pPr>
         <w:pStyle w:val="TableCaption"/>
@@ -7241,17 +7366,17 @@
         </w:tc>
       </w:tr>
     </w:tbl>
+    <w:bookmarkEnd w:id="149"/>
+    <w:p>
+      <w:r>
+        <w:br w:type="page"/>
+      </w:r>
+    </w:p>
+    <w:bookmarkEnd w:id="150"/>
+    <w:bookmarkEnd w:id="151"/>
     <w:bookmarkEnd w:id="152"/>
-    <w:p>
-      <w:r>
-        <w:br w:type="page"/>
-      </w:r>
-    </w:p>
     <w:bookmarkEnd w:id="153"/>
-    <w:bookmarkEnd w:id="154"/>
-    <w:bookmarkEnd w:id="155"/>
-    <w:bookmarkEnd w:id="156"/>
-    <w:bookmarkStart w:id="161" w:name="sec:service_data_model"/>
+    <w:bookmarkStart w:id="158" w:name="_5bf6f463f5552839b8532210262bd375968e263"/>
     <w:p>
       <w:pPr>
         <w:pStyle w:val="Heading1"/>
@@ -7292,7 +7417,7 @@
         <w:pStyle w:val="Compact"/>
         <w:numPr>
           <w:ilvl w:val="0"/>
-          <w:numId w:val="1013"/>
+          <w:numId w:val="1015"/>
         </w:numPr>
       </w:pPr>
       <w:r>
@@ -7304,7 +7429,7 @@
         <w:pStyle w:val="Compact"/>
         <w:numPr>
           <w:ilvl w:val="0"/>
-          <w:numId w:val="1013"/>
+          <w:numId w:val="1015"/>
         </w:numPr>
       </w:pPr>
       <w:r>
@@ -7316,7 +7441,7 @@
         <w:pStyle w:val="Compact"/>
         <w:numPr>
           <w:ilvl w:val="0"/>
-          <w:numId w:val="1013"/>
+          <w:numId w:val="1015"/>
         </w:numPr>
       </w:pPr>
       <w:r>
@@ -7360,10 +7485,10 @@
         <w:t xml:space="preserve"> </w:t>
       </w:r>
       <w:r>
-        <w:t xml:space="preserve">in Appendix 4aS-100 Part 17, introduces the Exchange Set data structure, precisely for supporting this functionality. To indicate that S-201 datasets are coupled with additional service metadata, we refer to the type S100ExchangeSet (see Figure 10).</w:t>
-      </w:r>
-    </w:p>
-    <w:bookmarkStart w:id="160" w:name="fig:s125_with_metadata"/>
+        <w:t xml:space="preserve">in Appendix 4aS-100 Part 17, introduces the Exchange Set data structure, precisely for supporting this functionality. To indicate that S-201 datasets are coupled with additional service metadata, we refer to the type S100ExchangeSet (see Figure 9).</w:t>
+      </w:r>
+    </w:p>
+    <w:bookmarkStart w:id="157" w:name="_0910f56a61d41cfa4eb323b2ad2b28bc273375f"/>
     <w:p>
       <w:pPr>
         <w:pStyle w:val="CaptionedFigure"/>
@@ -7373,18 +7498,18 @@
           <wp:inline>
             <wp:extent cx="4210050" cy="1666875"/>
             <wp:effectExtent b="0" l="0" r="0" t="0"/>
-            <wp:docPr descr="S-201 dataset coupled with service metadata in an S-100 Exchange Set." title="" id="158" name="Picture"/>
+            <wp:docPr descr="S-201 dataset coupled with service metadata in an S-100 Exchange Set." title="" id="155" name="Picture"/>
             <a:graphic>
               <a:graphicData uri="http://schemas.openxmlformats.org/drawingml/2006/picture">
                 <pic:pic>
                   <pic:nvPicPr>
-                    <pic:cNvPr descr="source/guideline/../../resources/S125WithMetadata.png" id="159" name="Picture"/>
+                    <pic:cNvPr descr="source/guideline/../../resources/S201WithMetadata.png" id="156" name="Picture"/>
                     <pic:cNvPicPr>
                       <a:picLocks noChangeArrowheads="1" noChangeAspect="1"/>
                     </pic:cNvPicPr>
                   </pic:nvPicPr>
                   <pic:blipFill>
-                    <a:blip r:embed="rId157"/>
+                    <a:blip r:embed="rId154"/>
                     <a:stretch>
                       <a:fillRect/>
                     </a:stretch>
@@ -7419,9 +7544,9 @@
         <w:t xml:space="preserve">S-201 dataset coupled with service metadata in an S-100 Exchange Set.</w:t>
       </w:r>
     </w:p>
-    <w:bookmarkEnd w:id="160"/>
-    <w:bookmarkEnd w:id="161"/>
-    <w:bookmarkStart w:id="162" w:name="service-internal-data-model"/>
+    <w:bookmarkEnd w:id="157"/>
+    <w:bookmarkEnd w:id="158"/>
+    <w:bookmarkStart w:id="159" w:name="_ec001e09143d562855064df11849a1b5aa6de8c"/>
     <w:p>
       <w:pPr>
         <w:pStyle w:val="Heading1"/>
@@ -7470,8 +7595,8 @@
         <w:br w:type="page"/>
       </w:r>
     </w:p>
-    <w:bookmarkEnd w:id="162"/>
-    <w:bookmarkStart w:id="177" w:name="sec:dynamic_behaviour"/>
+    <w:bookmarkEnd w:id="159"/>
+    <w:bookmarkStart w:id="174" w:name="_d3e58ffce74e5b4345ae6466f84876dd9e0371c"/>
     <w:p>
       <w:pPr>
         <w:pStyle w:val="Heading1"/>
@@ -7503,7 +7628,7 @@
         <w:t xml:space="preserve">: The description of the behaviour of the aforementioned operations, is provided in an abstract manner, where generic actions are performed on technology-agnostic endpoints. The implementation of each of these operations is left to be decided by the extending service design documents. In addition, any specific authentication procedure that is being applied is out of scope of the service specification and should be described in the service designs of this service.</w:t>
       </w:r>
     </w:p>
-    <w:bookmarkStart w:id="171" w:name="Xa8c46ada8d3a71107c9f5d2dc04e5eb37dc6132"/>
+    <w:bookmarkStart w:id="168" w:name="_a8c46ada8d3a71107c9f5d2dc04e5eb37dc6132"/>
     <w:p>
       <w:pPr>
         <w:pStyle w:val="Heading2"/>
@@ -7540,10 +7665,10 @@
         <w:pStyle w:val="BodyText"/>
       </w:pPr>
       <w:r>
-        <w:t xml:space="preserve">The first method is presented in Figure 11, where the service consumer uses directly the Get operation of the service provider. By utilising the available operation parameters such as the geometry and the time-period, only specific S-201 datasets matching the specified criteria and/or have updates on the specified time-period interval, will be retrieved, packaged into an S-100 Exchange Set, and returned as a response.</w:t>
-      </w:r>
-    </w:p>
-    <w:bookmarkStart w:id="166" w:name="fig:dynamic_behaviour_get_operation"/>
+        <w:t xml:space="preserve">The first method is presented in Figure 10, where the service consumer uses directly the Get operation of the service provider. By utilising the available operation parameters such as the geometry and the time-period, only specific S-201 datasets matching the specified criteria and/or have updates on the specified time-period interval, will be retrieved, packaged into an S-100 Exchange Set, and returned as a response.</w:t>
+      </w:r>
+    </w:p>
+    <w:bookmarkStart w:id="163" w:name="_1ff642e4fecce5a17548c87c91df23cd22776e8"/>
     <w:p>
       <w:pPr>
         <w:pStyle w:val="CaptionedFigure"/>
@@ -7553,18 +7678,18 @@
           <wp:inline>
             <wp:extent cx="6477000" cy="2829652"/>
             <wp:effectExtent b="0" l="0" r="0" t="0"/>
-            <wp:docPr descr="Client-Initiated AtoN Information Retrieval through the Get operation." title="" id="164" name="Picture"/>
+            <wp:docPr descr="diagram" title="" id="161" name="Picture"/>
             <a:graphic>
               <a:graphicData uri="http://schemas.openxmlformats.org/drawingml/2006/picture">
                 <pic:pic>
                   <pic:nvPicPr>
-                    <pic:cNvPr descr="source/guideline/./dynamic_behaviour-1.png" id="165" name="Picture"/>
+                    <pic:cNvPr descr="source/guideline/./dynamic_behaviour-1.png" id="162" name="Picture"/>
                     <pic:cNvPicPr>
                       <a:picLocks noChangeArrowheads="1" noChangeAspect="1"/>
                     </pic:cNvPicPr>
                   </pic:nvPicPr>
                   <pic:blipFill>
-                    <a:blip r:embed="rId163"/>
+                    <a:blip r:embed="rId160"/>
                     <a:stretch>
                       <a:fillRect/>
                     </a:stretch>
@@ -7599,16 +7724,16 @@
         <w:t xml:space="preserve">Client-Initiated AtoN Information Retrieval through the Get operation.</w:t>
       </w:r>
     </w:p>
-    <w:bookmarkEnd w:id="166"/>
-    <w:p>
-      <w:pPr>
-        <w:pStyle w:val="BodyText"/>
-      </w:pPr>
-      <w:r>
-        <w:t xml:space="preserve">In cases where the service consumer requires more information, before making a decision on which datasets should be downloaded, the latter “Client-initiated AtoN Information Retrieval” method can be utilised, by contacting the Get Summary operation beforehand. This is demonstrated in Figure 12, where the service consumer requests the list of the available S-201 dataset metadata via the summary operation and directly receives a response from the service provider. The service consumer can then select a dataset reference identifier from the returned list and request the detailed information (i.e. the complete S-201 dataset) back, through the Get operation of the service provider. The corresponding S-201 dataset (and/or its corresponding updates) will be packaged as an S-100 Exchange Set and then get sent back to the service consumer as direct response.</w:t>
-      </w:r>
-    </w:p>
-    <w:bookmarkStart w:id="170" w:name="Xa799260ab5ee587eb408857f814c1960d725c5c"/>
+    <w:bookmarkEnd w:id="163"/>
+    <w:p>
+      <w:pPr>
+        <w:pStyle w:val="FirstParagraph"/>
+      </w:pPr>
+      <w:r>
+        <w:t xml:space="preserve">In cases where the service consumer requires more information, before making a decision on which datasets should be downloaded, the latter “Client-initiated AtoN Information Retrieval” method can be utilised, by contacting the Get Summary operation beforehand. This is demonstrated in Figure 11, where the service consumer requests the list of the available S-201 dataset metadata via the summary operation and directly receives a response from the service provider. The service consumer can then select a dataset reference identifier from the returned list and request the detailed information (i.e. the complete S-201 dataset) back, through the Get operation of the service provider. The corresponding S-201 dataset (and/or its corresponding updates) will be packaged as an S-100 Exchange Set and then get sent back to the service consumer as direct response.</w:t>
+      </w:r>
+    </w:p>
+    <w:bookmarkStart w:id="167" w:name="_a799260ab5ee587eb408857f814c1960d725c5c"/>
     <w:p>
       <w:pPr>
         <w:pStyle w:val="CaptionedFigure"/>
@@ -7618,18 +7743,18 @@
           <wp:inline>
             <wp:extent cx="6477000" cy="3436973"/>
             <wp:effectExtent b="0" l="0" r="0" t="0"/>
-            <wp:docPr descr="Client-Initiated AtoN Information Retrieval through the Get Summary operation." title="" id="168" name="Picture"/>
+            <wp:docPr descr="diagram" title="" id="165" name="Picture"/>
             <a:graphic>
               <a:graphicData uri="http://schemas.openxmlformats.org/drawingml/2006/picture">
                 <pic:pic>
                   <pic:nvPicPr>
-                    <pic:cNvPr descr="source/guideline/./dynamic_behaviour-2.png" id="169" name="Picture"/>
+                    <pic:cNvPr descr="source/guideline/./dynamic_behaviour-2.png" id="166" name="Picture"/>
                     <pic:cNvPicPr>
                       <a:picLocks noChangeArrowheads="1" noChangeAspect="1"/>
                     </pic:cNvPicPr>
                   </pic:nvPicPr>
                   <pic:blipFill>
-                    <a:blip r:embed="rId167"/>
+                    <a:blip r:embed="rId164"/>
                     <a:stretch>
                       <a:fillRect/>
                     </a:stretch>
@@ -7664,39 +7789,39 @@
         <w:t xml:space="preserve">Client-Initiated AtoN Information Retrieval through the Get Summary operation.</w:t>
       </w:r>
     </w:p>
-    <w:bookmarkEnd w:id="170"/>
+    <w:bookmarkEnd w:id="167"/>
+    <w:p>
+      <w:pPr>
+        <w:pStyle w:val="FirstParagraph"/>
+      </w:pPr>
+      <w:r>
+        <w:t xml:space="preserve">As demonstrated in Figure 11, the Get Summary operation accepts similar operation parameters as the Get operation, which can be employed to filter the summary response list. This feature improves the flexibility of the whole operation as for example, even if a provided geometry operation parameter matches more than one S-201 datasets, only the required dataset will eventually be retrieved by the service consumer, by using its respective dataset reference identifier.</w:t>
+      </w:r>
+    </w:p>
+    <w:bookmarkEnd w:id="168"/>
+    <w:bookmarkStart w:id="173" w:name="_e1f4ba8c3d22d57be3c4dbcc66dda18514f615b"/>
+    <w:p>
+      <w:pPr>
+        <w:pStyle w:val="Heading2"/>
+      </w:pPr>
+      <w:r>
+        <w:t xml:space="preserve">Subscription-based AtoN Information Distribution</w:t>
+      </w:r>
+    </w:p>
+    <w:p>
+      <w:pPr>
+        <w:pStyle w:val="FirstParagraph"/>
+      </w:pPr>
+      <w:r>
+        <w:t xml:space="preserve">The subscription on AtoN Information is an alternative method of data propagation, in which a service consumer actively registers its interest to receive updates either on a specific set or alternatively, on all available S-201 datasets.</w:t>
+      </w:r>
+    </w:p>
     <w:p>
       <w:pPr>
         <w:pStyle w:val="BodyText"/>
       </w:pPr>
       <w:r>
-        <w:t xml:space="preserve">As demonstrated in Figure 12, the Get Summary operation accepts similar operation parameters as the Get operation, which can be employed to filter the summary response list. This feature improves the flexibility of the whole operation as for example, even if a provided geometry operation parameter matches more than one S-201 datasets, only the required dataset will eventually be retrieved by the service consumer, by using its respective dataset reference identifier.</w:t>
-      </w:r>
-    </w:p>
-    <w:bookmarkEnd w:id="171"/>
-    <w:bookmarkStart w:id="176" w:name="Xe1f4ba8c3d22d57be3c4dbcc66dda18514f615b"/>
-    <w:p>
-      <w:pPr>
-        <w:pStyle w:val="Heading2"/>
-      </w:pPr>
-      <w:r>
-        <w:t xml:space="preserve">Subscription-based AtoN Information Distribution</w:t>
-      </w:r>
-    </w:p>
-    <w:p>
-      <w:pPr>
-        <w:pStyle w:val="FirstParagraph"/>
-      </w:pPr>
-      <w:r>
-        <w:t xml:space="preserve">The subscription on AtoN Information is an alternative method of data propagation, in which a service consumer actively registers its interest to receive updates either on a specific set or alternatively, on all available S-201 datasets.</w:t>
-      </w:r>
-    </w:p>
-    <w:p>
-      <w:pPr>
-        <w:pStyle w:val="BodyText"/>
-      </w:pPr>
-      <w:r>
-        <w:t xml:space="preserve">Figure 13 illustrates the typical behaviour of the subscription operation. Initially, the service consumer is required to initiate the procedure through the Subscription operation of the service provider. By utilising the available operation parameters such as the geometry and the subscription period, only the specific S-201 datasets matching the specified criteria and have updates during the specified subscription interval will be covered. Once the subscription request has been received, processed and accepted by the service provider, a notification should be sent back to the service consumer, using its Subscription Notification operation. This notification will indicate that the requested subscription has commenced and should include a subscription identifier reference for the established subscription.</w:t>
+        <w:t xml:space="preserve">Figure 12 illustrates the typical behaviour of the subscription operation. Initially, the service consumer is required to initiate the procedure through the Subscription operation of the service provider. By utilising the available operation parameters such as the geometry and the subscription period, only the specific S-201 datasets matching the specified criteria and have updates during the specified subscription interval will be covered. Once the subscription request has been received, processed and accepted by the service provider, a notification should be sent back to the service consumer, using its Subscription Notification operation. This notification will indicate that the requested subscription has commenced and should include a subscription identifier reference for the established subscription.</w:t>
       </w:r>
     </w:p>
     <w:p>
@@ -7736,7 +7861,7 @@
         <w:pStyle w:val="Compact"/>
         <w:numPr>
           <w:ilvl w:val="0"/>
-          <w:numId w:val="1014"/>
+          <w:numId w:val="1016"/>
         </w:numPr>
       </w:pPr>
       <w:r>
@@ -7748,7 +7873,7 @@
         <w:pStyle w:val="Compact"/>
         <w:numPr>
           <w:ilvl w:val="0"/>
-          <w:numId w:val="1014"/>
+          <w:numId w:val="1016"/>
         </w:numPr>
       </w:pPr>
       <w:r>
@@ -7760,7 +7885,7 @@
         <w:pStyle w:val="Compact"/>
         <w:numPr>
           <w:ilvl w:val="0"/>
-          <w:numId w:val="1014"/>
+          <w:numId w:val="1016"/>
         </w:numPr>
       </w:pPr>
       <w:r>
@@ -7772,14 +7897,14 @@
         <w:pStyle w:val="Compact"/>
         <w:numPr>
           <w:ilvl w:val="0"/>
-          <w:numId w:val="1014"/>
+          <w:numId w:val="1016"/>
         </w:numPr>
       </w:pPr>
       <w:r>
         <w:t xml:space="preserve">An expected incident/unexpected error forces the service provider to terminate the subscription.</w:t>
       </w:r>
     </w:p>
-    <w:bookmarkStart w:id="175" w:name="X44dc000e6680f1b6a51373a720de64285719f5e"/>
+    <w:bookmarkStart w:id="172" w:name="_44dc000e6680f1b6a51373a720de64285719f5e"/>
     <w:p>
       <w:pPr>
         <w:pStyle w:val="CaptionedFigure"/>
@@ -7789,18 +7914,18 @@
           <wp:inline>
             <wp:extent cx="6477000" cy="4592449"/>
             <wp:effectExtent b="0" l="0" r="0" t="0"/>
-            <wp:docPr descr="Subscription requested by external service." title="" id="173" name="Picture"/>
+            <wp:docPr descr="diagram" title="" id="170" name="Picture"/>
             <a:graphic>
               <a:graphicData uri="http://schemas.openxmlformats.org/drawingml/2006/picture">
                 <pic:pic>
                   <pic:nvPicPr>
-                    <pic:cNvPr descr="source/guideline/./dynamic_behaviour-3.png" id="174" name="Picture"/>
+                    <pic:cNvPr descr="source/guideline/./dynamic_behaviour-3.png" id="171" name="Picture"/>
                     <pic:cNvPicPr>
                       <a:picLocks noChangeArrowheads="1" noChangeAspect="1"/>
                     </pic:cNvPicPr>
                   </pic:nvPicPr>
                   <pic:blipFill>
-                    <a:blip r:embed="rId172"/>
+                    <a:blip r:embed="rId169"/>
                     <a:stretch>
                       <a:fillRect/>
                     </a:stretch>
@@ -7835,20 +7960,20 @@
         <w:t xml:space="preserve">Subscription requested by external service.</w:t>
       </w:r>
     </w:p>
-    <w:bookmarkEnd w:id="175"/>
+    <w:bookmarkEnd w:id="172"/>
+    <w:p>
+      <w:pPr>
+        <w:pStyle w:val="FirstParagraph"/>
+      </w:pPr>
+      <w:r>
+        <w:t xml:space="preserve">In the sequence diagram presented in Figure 12, the established subscription is terminated though a service consumer request. This should include the identifier reference of the subscription to be terminated, otherwise the service provider will terminate all active subscriptions for the service consumer performing the request. Once the service consumer’s request has been received, processed, and accepted by the service provider, another notification will be sent back to the service consumer’s Subscription Notification operation, to terminate the subscription process.</w:t>
+      </w:r>
+    </w:p>
     <w:p>
       <w:pPr>
         <w:pStyle w:val="BodyText"/>
       </w:pPr>
       <w:r>
-        <w:t xml:space="preserve">In the sequence diagram presented in Figure 13, the established subscription is terminated though a service consumer request. This should include the identifier reference of the subscription to be terminated, otherwise the service provider will terminate all active subscriptions for the service consumer performing the request. Once the service consumer’s request has been received, processed, and accepted by the service provider, another notification will be sent back to the service consumer’s Subscription Notification operation, to terminate the subscription process.</w:t>
-      </w:r>
-    </w:p>
-    <w:p>
-      <w:pPr>
-        <w:pStyle w:val="BodyText"/>
-      </w:pPr>
-      <w:r>
         <w:t xml:space="preserve">Note that the full contents of the S-201 datasets covered by a subscription, are not send back to the service consumer, unless a new dataset is created within the active period of an existing subscription that covers it. In all other cases, only the S-201 dataset changes will be transferred, in order to conserve bandwidth. Therefore, service consumer needs to utilise the Get (and Get Summary) operations, if the full contents of the S-201 datasets are required.</w:t>
       </w:r>
     </w:p>
@@ -7857,9 +7982,9 @@
         <w:br w:type="page"/>
       </w:r>
     </w:p>
-    <w:bookmarkEnd w:id="176"/>
-    <w:bookmarkEnd w:id="177"/>
-    <w:bookmarkStart w:id="191" w:name="references"/>
+    <w:bookmarkEnd w:id="173"/>
+    <w:bookmarkEnd w:id="174"/>
+    <w:bookmarkStart w:id="188" w:name="_references"/>
     <w:p>
       <w:pPr>
         <w:pStyle w:val="Heading1"/>
@@ -7868,8 +7993,8 @@
         <w:t xml:space="preserve">References</w:t>
       </w:r>
     </w:p>
-    <w:bookmarkStart w:id="190" w:name="refs"/>
-    <w:bookmarkStart w:id="179" w:name="ref-cite:iala-g1128"/>
+    <w:bookmarkStart w:id="187" w:name="_refs"/>
+    <w:bookmarkStart w:id="176" w:name="_0b47f46b10ab145f237c47e8f9a1596159c21b8"/>
     <w:p>
       <w:pPr>
         <w:pStyle w:val="Bibliography"/>
@@ -7901,7 +8026,7 @@
       <w:r>
         <w:t xml:space="preserve"> </w:t>
       </w:r>
-      <w:hyperlink r:id="rId178">
+      <w:hyperlink r:id="rId175">
         <w:r>
           <w:rPr>
             <w:rStyle w:val="Hyperlink"/>
@@ -7910,8 +8035,8 @@
         </w:r>
       </w:hyperlink>
     </w:p>
-    <w:bookmarkEnd w:id="179"/>
-    <w:bookmarkStart w:id="180" w:name="ref-cite:iala-s201"/>
+    <w:bookmarkEnd w:id="176"/>
+    <w:bookmarkStart w:id="177" w:name="_144641ce07337b0e21bf947c218d288d8342822"/>
     <w:p>
       <w:pPr>
         <w:pStyle w:val="Bibliography"/>
@@ -7941,8 +8066,8 @@
         <w:t xml:space="preserve">Standard 2.0.0.</w:t>
       </w:r>
     </w:p>
-    <w:bookmarkEnd w:id="180"/>
-    <w:bookmarkStart w:id="182" w:name="ref-cite:iala-ms2"/>
+    <w:bookmarkEnd w:id="177"/>
+    <w:bookmarkStart w:id="179" w:name="_a71ce71395f6ae655380231bfac30ec50fc63f7"/>
     <w:p>
       <w:pPr>
         <w:pStyle w:val="Bibliography"/>
@@ -7974,7 +8099,7 @@
       <w:r>
         <w:t xml:space="preserve"> </w:t>
       </w:r>
-      <w:hyperlink r:id="rId181">
+      <w:hyperlink r:id="rId178">
         <w:r>
           <w:rPr>
             <w:rStyle w:val="Hyperlink"/>
@@ -7983,8 +8108,8 @@
         </w:r>
       </w:hyperlink>
     </w:p>
-    <w:bookmarkEnd w:id="182"/>
-    <w:bookmarkStart w:id="183" w:name="ref-cite:iho-s125-interoperability-guide"/>
+    <w:bookmarkEnd w:id="179"/>
+    <w:bookmarkStart w:id="180" w:name="_a9adff0a198a6dc23adaf8e98cc2a762ba3c022"/>
     <w:p>
       <w:pPr>
         <w:pStyle w:val="Bibliography"/>
@@ -8014,8 +8139,8 @@
         <w:t xml:space="preserve">Report 1.0.0.</w:t>
       </w:r>
     </w:p>
-    <w:bookmarkEnd w:id="183"/>
-    <w:bookmarkStart w:id="185" w:name="ref-cite:iec-63173-2"/>
+    <w:bookmarkEnd w:id="180"/>
+    <w:bookmarkStart w:id="182" w:name="_62c097ad28c4b21aadec654955b40e5412e6be2"/>
     <w:p>
       <w:pPr>
         <w:pStyle w:val="Bibliography"/>
@@ -8047,7 +8172,7 @@
       <w:r>
         <w:t xml:space="preserve"> </w:t>
       </w:r>
-      <w:hyperlink r:id="rId184">
+      <w:hyperlink r:id="rId181">
         <w:r>
           <w:rPr>
             <w:rStyle w:val="Hyperlink"/>
@@ -8056,8 +8181,8 @@
         </w:r>
       </w:hyperlink>
     </w:p>
-    <w:bookmarkEnd w:id="185"/>
-    <w:bookmarkStart w:id="187" w:name="ref-cite:iho-s100"/>
+    <w:bookmarkEnd w:id="182"/>
+    <w:bookmarkStart w:id="184" w:name="_9b4b35f40fd92e9933f1c8daf7e40dec1db3548"/>
     <w:p>
       <w:pPr>
         <w:pStyle w:val="Bibliography"/>
@@ -8089,7 +8214,7 @@
       <w:r>
         <w:t xml:space="preserve"> </w:t>
       </w:r>
-      <w:hyperlink r:id="rId186">
+      <w:hyperlink r:id="rId183">
         <w:r>
           <w:rPr>
             <w:rStyle w:val="Hyperlink"/>
@@ -8098,8 +8223,8 @@
         </w:r>
       </w:hyperlink>
     </w:p>
-    <w:bookmarkEnd w:id="187"/>
-    <w:bookmarkStart w:id="189" w:name="ref-cite:iala-g1157"/>
+    <w:bookmarkEnd w:id="184"/>
+    <w:bookmarkStart w:id="186" w:name="_0187158084b43b069f52a36774e1f3d884ed99c"/>
     <w:p>
       <w:pPr>
         <w:pStyle w:val="Bibliography"/>
@@ -8131,7 +8256,7 @@
       <w:r>
         <w:t xml:space="preserve"> </w:t>
       </w:r>
-      <w:hyperlink r:id="rId188">
+      <w:hyperlink r:id="rId185">
         <w:r>
           <w:rPr>
             <w:rStyle w:val="Hyperlink"/>
@@ -8140,15 +8265,15 @@
         </w:r>
       </w:hyperlink>
     </w:p>
-    <w:bookmarkEnd w:id="189"/>
-    <w:bookmarkEnd w:id="190"/>
+    <w:bookmarkEnd w:id="186"/>
+    <w:bookmarkEnd w:id="187"/>
     <w:p>
       <w:r>
         <w:br w:type="page"/>
       </w:r>
     </w:p>
-    <w:bookmarkEnd w:id="191"/>
-    <w:bookmarkStart w:id="195" w:name="sec:acronyms_and_terminology"/>
+    <w:bookmarkEnd w:id="188"/>
+    <w:bookmarkStart w:id="192" w:name="_a6f246967ec05921d1af89a4eefd5a4b74476a3"/>
     <w:p>
       <w:pPr>
         <w:pStyle w:val="Heading1"/>
@@ -8157,7 +8282,7 @@
         <w:t xml:space="preserve">Acronyms and Terminology</w:t>
       </w:r>
     </w:p>
-    <w:bookmarkStart w:id="194" w:name="sec:acronyms"/>
+    <w:bookmarkStart w:id="191" w:name="_c0af5d4845e546aca099160f27526177c1d3cbf"/>
     <w:p>
       <w:pPr>
         <w:pStyle w:val="Heading2"/>
@@ -8166,7 +8291,7 @@
         <w:t xml:space="preserve">Acronyms</w:t>
       </w:r>
     </w:p>
-    <w:bookmarkStart w:id="192" w:name="tbl:acronyms"/>
+    <w:bookmarkStart w:id="189" w:name="_77b39a402af6bfe119bab419832ae02a6956a58"/>
     <w:p>
       <w:pPr>
         <w:pStyle w:val="TableCaption"/>
@@ -8664,9 +8789,9 @@
         </w:tc>
       </w:tr>
     </w:tbl>
-    <w:bookmarkEnd w:id="192"/>
+    <w:bookmarkEnd w:id="189"/>
     <w:p/>
-    <w:bookmarkStart w:id="193" w:name="tbl:terminology"/>
+    <w:bookmarkStart w:id="190" w:name="_fe740c36bce682192465c9d433bd34618b16760"/>
     <w:p>
       <w:pPr>
         <w:pStyle w:val="TableCaption"/>
@@ -9375,9 +9500,9 @@
         </w:tc>
       </w:tr>
     </w:tbl>
-    <w:bookmarkEnd w:id="193"/>
-    <w:bookmarkEnd w:id="194"/>
-    <w:bookmarkEnd w:id="195"/>
+    <w:bookmarkEnd w:id="190"/>
+    <w:bookmarkEnd w:id="191"/>
+    <w:bookmarkEnd w:id="192"/>
     <w:sectPr>
       <w:headerReference r:id="rId54" w:type="even"/>
       <w:headerReference r:id="rId55" w:type="default"/>
@@ -13288,6 +13413,9 @@
     <w:abstractNumId w:val="991"/>
   </w:num>
   <w:num w:numId="1006">
+    <w:abstractNumId w:val="991"/>
+  </w:num>
+  <w:num w:numId="1007">
     <w:abstractNumId w:val="99411"/>
     <w:lvlOverride w:ilvl="0">
       <w:startOverride w:val="1"/>
@@ -13317,11 +13445,35 @@
       <w:startOverride w:val="1"/>
     </w:lvlOverride>
   </w:num>
-  <w:num w:numId="1007">
-    <w:abstractNumId w:val="991"/>
-  </w:num>
   <w:num w:numId="1008">
-    <w:abstractNumId w:val="991"/>
+    <w:abstractNumId w:val="99411"/>
+    <w:lvlOverride w:ilvl="0">
+      <w:startOverride w:val="1"/>
+    </w:lvlOverride>
+    <w:lvlOverride w:ilvl="1">
+      <w:startOverride w:val="1"/>
+    </w:lvlOverride>
+    <w:lvlOverride w:ilvl="2">
+      <w:startOverride w:val="1"/>
+    </w:lvlOverride>
+    <w:lvlOverride w:ilvl="3">
+      <w:startOverride w:val="1"/>
+    </w:lvlOverride>
+    <w:lvlOverride w:ilvl="4">
+      <w:startOverride w:val="1"/>
+    </w:lvlOverride>
+    <w:lvlOverride w:ilvl="5">
+      <w:startOverride w:val="1"/>
+    </w:lvlOverride>
+    <w:lvlOverride w:ilvl="6">
+      <w:startOverride w:val="1"/>
+    </w:lvlOverride>
+    <w:lvlOverride w:ilvl="7">
+      <w:startOverride w:val="1"/>
+    </w:lvlOverride>
+    <w:lvlOverride w:ilvl="8">
+      <w:startOverride w:val="1"/>
+    </w:lvlOverride>
   </w:num>
   <w:num w:numId="1009">
     <w:abstractNumId w:val="991"/>
@@ -13339,6 +13491,12 @@
     <w:abstractNumId w:val="991"/>
   </w:num>
   <w:num w:numId="1014">
+    <w:abstractNumId w:val="991"/>
+  </w:num>
+  <w:num w:numId="1015">
+    <w:abstractNumId w:val="991"/>
+  </w:num>
+  <w:num w:numId="1016">
     <w:abstractNumId w:val="99411"/>
     <w:lvlOverride w:ilvl="0">
       <w:startOverride w:val="1"/>

</xml_diff>